<commit_message>
feat(C4/C5/C9/C12/C17/C19): déploiement Railway + corrections API + docs soutenance
</commit_message>
<xml_diff>
--- a/veille_C6_final.docx
+++ b/veille_C6_final.docx
@@ -1,6 +1,6 @@
 
 <file path=word/document.xml><?xml version="1.0" encoding="utf-8"?>
-<w:document xmlns:wpc="http://schemas.microsoft.com/office/word/2010/wordprocessingCanvas" xmlns:cx="http://schemas.microsoft.com/office/drawing/2014/chartex" xmlns:cx1="http://schemas.microsoft.com/office/drawing/2015/9/8/chartex" xmlns:cx2="http://schemas.microsoft.com/office/drawing/2015/10/21/chartex" xmlns:cx3="http://schemas.microsoft.com/office/drawing/2016/5/9/chartex" xmlns:cx4="http://schemas.microsoft.com/office/drawing/2016/5/10/chartex" xmlns:cx5="http://schemas.microsoft.com/office/drawing/2016/5/11/chartex" xmlns:cx6="http://schemas.microsoft.com/office/drawing/2016/5/12/chartex" xmlns:cx7="http://schemas.microsoft.com/office/drawing/2016/5/13/chartex" xmlns:cx8="http://schemas.microsoft.com/office/drawing/2016/5/14/chartex" xmlns:mc="http://schemas.openxmlformats.org/markup-compatibility/2006" xmlns:aink="http://schemas.microsoft.com/office/drawing/2016/ink" xmlns:am3d="http://schemas.microsoft.com/office/drawing/2017/model3d" xmlns:o="urn:schemas-microsoft-com:office:office" xmlns:oel="http://schemas.microsoft.com/office/2019/extlst" xmlns:r="http://schemas.openxmlformats.org/officeDocument/2006/relationships" xmlns:m="http://schemas.openxmlformats.org/officeDocument/2006/math" xmlns:v="urn:schemas-microsoft-com:vml" xmlns:wp14="http://schemas.microsoft.com/office/word/2010/wordprocessingDrawing" xmlns:wp="http://schemas.openxmlformats.org/drawingml/2006/wordprocessingDrawing" xmlns:w10="urn:schemas-microsoft-com:office:word" xmlns:w="http://schemas.openxmlformats.org/wordprocessingml/2006/main" xmlns:w14="http://schemas.microsoft.com/office/word/2010/wordml" xmlns:w15="http://schemas.microsoft.com/office/word/2012/wordml" xmlns:w16cex="http://schemas.microsoft.com/office/word/2018/wordml/cex" xmlns:w16cid="http://schemas.microsoft.com/office/word/2016/wordml/cid" xmlns:w16="http://schemas.microsoft.com/office/word/2018/wordml" xmlns:w16du="http://schemas.microsoft.com/office/word/2023/wordml/word16du" xmlns:w16sdtdh="http://schemas.microsoft.com/office/word/2020/wordml/sdtdatahash" xmlns:w16sdtfl="http://schemas.microsoft.com/office/word/2024/wordml/sdtformatlock" xmlns:w16se="http://schemas.microsoft.com/office/word/2015/wordml/symex" xmlns:wpg="http://schemas.microsoft.com/office/word/2010/wordprocessingGroup" xmlns:wpi="http://schemas.microsoft.com/office/word/2010/wordprocessingInk" xmlns:wne="http://schemas.microsoft.com/office/word/2006/wordml" xmlns:wps="http://schemas.microsoft.com/office/word/2010/wordprocessingShape" mc:Ignorable="w14 w15 w16se w16cid w16 w16cex w16sdtdh w16sdtfl w16du wp14">
+<w:document xmlns:wpc="http://schemas.microsoft.com/office/word/2010/wordprocessingCanvas" xmlns:cx="http://schemas.microsoft.com/office/drawing/2014/chartex" xmlns:cx1="http://schemas.microsoft.com/office/drawing/2015/9/8/chartex" xmlns:cx2="http://schemas.microsoft.com/office/drawing/2015/10/21/chartex" xmlns:cx3="http://schemas.microsoft.com/office/drawing/2016/5/9/chartex" xmlns:cx4="http://schemas.microsoft.com/office/drawing/2016/5/10/chartex" xmlns:cx5="http://schemas.microsoft.com/office/drawing/2016/5/11/chartex" xmlns:cx6="http://schemas.microsoft.com/office/drawing/2016/5/12/chartex" xmlns:cx7="http://schemas.microsoft.com/office/drawing/2016/5/13/chartex" xmlns:cx8="http://schemas.microsoft.com/office/drawing/2016/5/14/chartex" xmlns:mc="http://schemas.openxmlformats.org/markup-compatibility/2006" xmlns:aink="http://schemas.microsoft.com/office/drawing/2016/ink" xmlns:am3d="http://schemas.microsoft.com/office/drawing/2017/model3d" xmlns:o="urn:schemas-microsoft-com:office:office" xmlns:oel="http://schemas.microsoft.com/office/2019/extlst" xmlns:r="http://schemas.openxmlformats.org/officeDocument/2006/relationships" xmlns:m="http://schemas.openxmlformats.org/officeDocument/2006/math" xmlns:v="urn:schemas-microsoft-com:vml" xmlns:wp14="http://schemas.microsoft.com/office/word/2010/wordprocessingDrawing" xmlns:wp="http://schemas.openxmlformats.org/drawingml/2006/wordprocessingDrawing" xmlns:w10="urn:schemas-microsoft-com:office:word" xmlns:w="http://schemas.openxmlformats.org/wordprocessingml/2006/main" xmlns:w14="http://schemas.microsoft.com/office/word/2010/wordml" xmlns:w15="http://schemas.microsoft.com/office/word/2012/wordml" xmlns:w16cei="http://schemas.microsoft.com/office/word/2026/wordml/cei" xmlns:w16cex="http://schemas.microsoft.com/office/word/2018/wordml/cex" xmlns:w16cid="http://schemas.microsoft.com/office/word/2016/wordml/cid" xmlns:w16="http://schemas.microsoft.com/office/word/2018/wordml" xmlns:w16du="http://schemas.microsoft.com/office/word/2023/wordml/word16du" xmlns:w16sdtdh="http://schemas.microsoft.com/office/word/2020/wordml/sdtdatahash" xmlns:w16sdtfl="http://schemas.microsoft.com/office/word/2024/wordml/sdtformatlock" xmlns:w16se="http://schemas.microsoft.com/office/word/2015/wordml/symex" xmlns:wpg="http://schemas.microsoft.com/office/word/2010/wordprocessingGroup" xmlns:wpi="http://schemas.microsoft.com/office/word/2010/wordprocessingInk" xmlns:wne="http://schemas.microsoft.com/office/word/2006/wordml" xmlns:wps="http://schemas.microsoft.com/office/word/2010/wordprocessingShape" mc:Ignorable="w14 w15 w16se w16cid w16 w16cex w16sdtdh w16sdtfl w16du wp14">
   <w:body>
     <w:p>
       <w:pPr>
@@ -692,8 +692,10 @@
               <w:tab w:val="right" w:leader="dot" w:pos="8656"/>
             </w:tabs>
             <w:rPr>
+              <w:rFonts w:asciiTheme="minorHAnsi" w:eastAsiaTheme="minorEastAsia" w:hAnsiTheme="minorHAnsi" w:cstheme="minorBidi"/>
               <w:noProof/>
-              <w:color w:val="000000" w:themeColor="text1"/>
+              <w:kern w:val="2"/>
+              <w14:ligatures w14:val="standardContextual"/>
             </w:rPr>
           </w:pPr>
           <w:r>
@@ -714,12 +716,13 @@
             </w:rPr>
             <w:fldChar w:fldCharType="separate"/>
           </w:r>
-          <w:hyperlink w:anchor="_Toc235790501" w:history="1">
+          <w:hyperlink w:anchor="_Toc237516248" w:history="1">
             <w:r>
               <w:rPr>
                 <w:rStyle w:val="Lienhypertexte"/>
+                <w:b/>
+                <w:bCs/>
                 <w:noProof/>
-                <w:color w:val="000000" w:themeColor="text1"/>
               </w:rPr>
               <w:t>1. Introduction</w:t>
             </w:r>
@@ -727,7 +730,6 @@
               <w:rPr>
                 <w:noProof/>
                 <w:webHidden/>
-                <w:color w:val="000000" w:themeColor="text1"/>
               </w:rPr>
               <w:tab/>
             </w:r>
@@ -735,7 +737,6 @@
               <w:rPr>
                 <w:noProof/>
                 <w:webHidden/>
-                <w:color w:val="000000" w:themeColor="text1"/>
               </w:rPr>
               <w:fldChar w:fldCharType="begin"/>
             </w:r>
@@ -743,22 +744,19 @@
               <w:rPr>
                 <w:noProof/>
                 <w:webHidden/>
-                <w:color w:val="000000" w:themeColor="text1"/>
-              </w:rPr>
-              <w:instrText xml:space="preserve"> PAGEREF _Toc235790501 \h </w:instrText>
+              </w:rPr>
+              <w:instrText xml:space="preserve"> PAGEREF _Toc237516248 \h </w:instrText>
             </w:r>
             <w:r>
               <w:rPr>
                 <w:noProof/>
                 <w:webHidden/>
-                <w:color w:val="000000" w:themeColor="text1"/>
               </w:rPr>
             </w:r>
             <w:r>
               <w:rPr>
                 <w:noProof/>
                 <w:webHidden/>
-                <w:color w:val="000000" w:themeColor="text1"/>
               </w:rPr>
               <w:fldChar w:fldCharType="separate"/>
             </w:r>
@@ -766,7 +764,6 @@
               <w:rPr>
                 <w:noProof/>
                 <w:webHidden/>
-                <w:color w:val="000000" w:themeColor="text1"/>
               </w:rPr>
               <w:t>3</w:t>
             </w:r>
@@ -774,7 +771,6 @@
               <w:rPr>
                 <w:noProof/>
                 <w:webHidden/>
-                <w:color w:val="000000" w:themeColor="text1"/>
               </w:rPr>
               <w:fldChar w:fldCharType="end"/>
             </w:r>
@@ -787,16 +783,19 @@
               <w:tab w:val="right" w:leader="dot" w:pos="8656"/>
             </w:tabs>
             <w:rPr>
+              <w:rFonts w:asciiTheme="minorHAnsi" w:eastAsiaTheme="minorEastAsia" w:hAnsiTheme="minorHAnsi" w:cstheme="minorBidi"/>
               <w:noProof/>
-              <w:color w:val="000000" w:themeColor="text1"/>
+              <w:kern w:val="2"/>
+              <w14:ligatures w14:val="standardContextual"/>
             </w:rPr>
           </w:pPr>
-          <w:hyperlink w:anchor="_Toc235790502" w:history="1">
+          <w:hyperlink w:anchor="_Toc237516249" w:history="1">
             <w:r>
               <w:rPr>
                 <w:rStyle w:val="Lienhypertexte"/>
+                <w:b/>
+                <w:bCs/>
                 <w:noProof/>
-                <w:color w:val="000000" w:themeColor="text1"/>
               </w:rPr>
               <w:t>1.1 Contexte du projet inflation-tracker</w:t>
             </w:r>
@@ -804,7 +803,6 @@
               <w:rPr>
                 <w:noProof/>
                 <w:webHidden/>
-                <w:color w:val="000000" w:themeColor="text1"/>
               </w:rPr>
               <w:tab/>
             </w:r>
@@ -812,7 +810,6 @@
               <w:rPr>
                 <w:noProof/>
                 <w:webHidden/>
-                <w:color w:val="000000" w:themeColor="text1"/>
               </w:rPr>
               <w:fldChar w:fldCharType="begin"/>
             </w:r>
@@ -820,22 +817,19 @@
               <w:rPr>
                 <w:noProof/>
                 <w:webHidden/>
-                <w:color w:val="000000" w:themeColor="text1"/>
-              </w:rPr>
-              <w:instrText xml:space="preserve"> PAGEREF _Toc235790502 \h </w:instrText>
+              </w:rPr>
+              <w:instrText xml:space="preserve"> PAGEREF _Toc237516249 \h </w:instrText>
             </w:r>
             <w:r>
               <w:rPr>
                 <w:noProof/>
                 <w:webHidden/>
-                <w:color w:val="000000" w:themeColor="text1"/>
               </w:rPr>
             </w:r>
             <w:r>
               <w:rPr>
                 <w:noProof/>
                 <w:webHidden/>
-                <w:color w:val="000000" w:themeColor="text1"/>
               </w:rPr>
               <w:fldChar w:fldCharType="separate"/>
             </w:r>
@@ -843,7 +837,6 @@
               <w:rPr>
                 <w:noProof/>
                 <w:webHidden/>
-                <w:color w:val="000000" w:themeColor="text1"/>
               </w:rPr>
               <w:t>3</w:t>
             </w:r>
@@ -851,7 +844,6 @@
               <w:rPr>
                 <w:noProof/>
                 <w:webHidden/>
-                <w:color w:val="000000" w:themeColor="text1"/>
               </w:rPr>
               <w:fldChar w:fldCharType="end"/>
             </w:r>
@@ -864,24 +856,26 @@
               <w:tab w:val="right" w:leader="dot" w:pos="8656"/>
             </w:tabs>
             <w:rPr>
+              <w:rFonts w:asciiTheme="minorHAnsi" w:eastAsiaTheme="minorEastAsia" w:hAnsiTheme="minorHAnsi" w:cstheme="minorBidi"/>
               <w:noProof/>
-              <w:color w:val="000000" w:themeColor="text1"/>
+              <w:kern w:val="2"/>
+              <w14:ligatures w14:val="standardContextual"/>
             </w:rPr>
           </w:pPr>
-          <w:hyperlink w:anchor="_Toc235790503" w:history="1">
+          <w:hyperlink w:anchor="_Toc237516250" w:history="1">
             <w:r>
               <w:rPr>
                 <w:rStyle w:val="Lienhypertexte"/>
+                <w:b/>
+                <w:bCs/>
                 <w:noProof/>
-                <w:color w:val="000000" w:themeColor="text1"/>
-              </w:rPr>
-              <w:t>1.2 Problematique</w:t>
+              </w:rPr>
+              <w:t>1.2 Problématique</w:t>
             </w:r>
             <w:r>
               <w:rPr>
                 <w:noProof/>
                 <w:webHidden/>
-                <w:color w:val="000000" w:themeColor="text1"/>
               </w:rPr>
               <w:tab/>
             </w:r>
@@ -889,7 +883,6 @@
               <w:rPr>
                 <w:noProof/>
                 <w:webHidden/>
-                <w:color w:val="000000" w:themeColor="text1"/>
               </w:rPr>
               <w:fldChar w:fldCharType="begin"/>
             </w:r>
@@ -897,22 +890,19 @@
               <w:rPr>
                 <w:noProof/>
                 <w:webHidden/>
-                <w:color w:val="000000" w:themeColor="text1"/>
-              </w:rPr>
-              <w:instrText xml:space="preserve"> PAGEREF _Toc235790503 \h </w:instrText>
+              </w:rPr>
+              <w:instrText xml:space="preserve"> PAGEREF _Toc237516250 \h </w:instrText>
             </w:r>
             <w:r>
               <w:rPr>
                 <w:noProof/>
                 <w:webHidden/>
-                <w:color w:val="000000" w:themeColor="text1"/>
               </w:rPr>
             </w:r>
             <w:r>
               <w:rPr>
                 <w:noProof/>
                 <w:webHidden/>
-                <w:color w:val="000000" w:themeColor="text1"/>
               </w:rPr>
               <w:fldChar w:fldCharType="separate"/>
             </w:r>
@@ -920,15 +910,13 @@
               <w:rPr>
                 <w:noProof/>
                 <w:webHidden/>
-                <w:color w:val="000000" w:themeColor="text1"/>
-              </w:rPr>
-              <w:t>3</w:t>
+              </w:rPr>
+              <w:t>5</w:t>
             </w:r>
             <w:r>
               <w:rPr>
                 <w:noProof/>
                 <w:webHidden/>
-                <w:color w:val="000000" w:themeColor="text1"/>
               </w:rPr>
               <w:fldChar w:fldCharType="end"/>
             </w:r>
@@ -941,16 +929,19 @@
               <w:tab w:val="right" w:leader="dot" w:pos="8656"/>
             </w:tabs>
             <w:rPr>
+              <w:rFonts w:asciiTheme="minorHAnsi" w:eastAsiaTheme="minorEastAsia" w:hAnsiTheme="minorHAnsi" w:cstheme="minorBidi"/>
               <w:noProof/>
-              <w:color w:val="000000" w:themeColor="text1"/>
+              <w:kern w:val="2"/>
+              <w14:ligatures w14:val="standardContextual"/>
             </w:rPr>
           </w:pPr>
-          <w:hyperlink w:anchor="_Toc235790504" w:history="1">
+          <w:hyperlink w:anchor="_Toc237516251" w:history="1">
             <w:r>
               <w:rPr>
                 <w:rStyle w:val="Lienhypertexte"/>
+                <w:b/>
+                <w:bCs/>
                 <w:noProof/>
-                <w:color w:val="000000" w:themeColor="text1"/>
               </w:rPr>
               <w:t>1.3 Objectif de la veille</w:t>
             </w:r>
@@ -958,7 +949,6 @@
               <w:rPr>
                 <w:noProof/>
                 <w:webHidden/>
-                <w:color w:val="000000" w:themeColor="text1"/>
               </w:rPr>
               <w:tab/>
             </w:r>
@@ -966,7 +956,6 @@
               <w:rPr>
                 <w:noProof/>
                 <w:webHidden/>
-                <w:color w:val="000000" w:themeColor="text1"/>
               </w:rPr>
               <w:fldChar w:fldCharType="begin"/>
             </w:r>
@@ -974,22 +963,19 @@
               <w:rPr>
                 <w:noProof/>
                 <w:webHidden/>
-                <w:color w:val="000000" w:themeColor="text1"/>
-              </w:rPr>
-              <w:instrText xml:space="preserve"> PAGEREF _Toc235790504 \h </w:instrText>
+              </w:rPr>
+              <w:instrText xml:space="preserve"> PAGEREF _Toc237516251 \h </w:instrText>
             </w:r>
             <w:r>
               <w:rPr>
                 <w:noProof/>
                 <w:webHidden/>
-                <w:color w:val="000000" w:themeColor="text1"/>
               </w:rPr>
             </w:r>
             <w:r>
               <w:rPr>
                 <w:noProof/>
                 <w:webHidden/>
-                <w:color w:val="000000" w:themeColor="text1"/>
               </w:rPr>
               <w:fldChar w:fldCharType="separate"/>
             </w:r>
@@ -997,15 +983,13 @@
               <w:rPr>
                 <w:noProof/>
                 <w:webHidden/>
-                <w:color w:val="000000" w:themeColor="text1"/>
-              </w:rPr>
-              <w:t>4</w:t>
+              </w:rPr>
+              <w:t>6</w:t>
             </w:r>
             <w:r>
               <w:rPr>
                 <w:noProof/>
                 <w:webHidden/>
-                <w:color w:val="000000" w:themeColor="text1"/>
               </w:rPr>
               <w:fldChar w:fldCharType="end"/>
             </w:r>
@@ -1018,24 +1002,26 @@
               <w:tab w:val="right" w:leader="dot" w:pos="8656"/>
             </w:tabs>
             <w:rPr>
+              <w:rFonts w:asciiTheme="minorHAnsi" w:eastAsiaTheme="minorEastAsia" w:hAnsiTheme="minorHAnsi" w:cstheme="minorBidi"/>
               <w:noProof/>
-              <w:color w:val="000000" w:themeColor="text1"/>
+              <w:kern w:val="2"/>
+              <w14:ligatures w14:val="standardContextual"/>
             </w:rPr>
           </w:pPr>
-          <w:hyperlink w:anchor="_Toc235790505" w:history="1">
+          <w:hyperlink w:anchor="_Toc237516252" w:history="1">
             <w:r>
               <w:rPr>
                 <w:rStyle w:val="Lienhypertexte"/>
+                <w:b/>
+                <w:bCs/>
                 <w:noProof/>
-                <w:color w:val="000000" w:themeColor="text1"/>
-              </w:rPr>
-              <w:t>2. Panorama des methodes de prevision de series temporelles</w:t>
+              </w:rPr>
+              <w:t>2. Panorama des méthodes de prévision de séries temporelles</w:t>
             </w:r>
             <w:r>
               <w:rPr>
                 <w:noProof/>
                 <w:webHidden/>
-                <w:color w:val="000000" w:themeColor="text1"/>
               </w:rPr>
               <w:tab/>
             </w:r>
@@ -1043,7 +1029,6 @@
               <w:rPr>
                 <w:noProof/>
                 <w:webHidden/>
-                <w:color w:val="000000" w:themeColor="text1"/>
               </w:rPr>
               <w:fldChar w:fldCharType="begin"/>
             </w:r>
@@ -1051,22 +1036,19 @@
               <w:rPr>
                 <w:noProof/>
                 <w:webHidden/>
-                <w:color w:val="000000" w:themeColor="text1"/>
-              </w:rPr>
-              <w:instrText xml:space="preserve"> PAGEREF _Toc235790505 \h </w:instrText>
+              </w:rPr>
+              <w:instrText xml:space="preserve"> PAGEREF _Toc237516252 \h </w:instrText>
             </w:r>
             <w:r>
               <w:rPr>
                 <w:noProof/>
                 <w:webHidden/>
-                <w:color w:val="000000" w:themeColor="text1"/>
               </w:rPr>
             </w:r>
             <w:r>
               <w:rPr>
                 <w:noProof/>
                 <w:webHidden/>
-                <w:color w:val="000000" w:themeColor="text1"/>
               </w:rPr>
               <w:fldChar w:fldCharType="separate"/>
             </w:r>
@@ -1074,15 +1056,13 @@
               <w:rPr>
                 <w:noProof/>
                 <w:webHidden/>
-                <w:color w:val="000000" w:themeColor="text1"/>
-              </w:rPr>
-              <w:t>5</w:t>
+              </w:rPr>
+              <w:t>6</w:t>
             </w:r>
             <w:r>
               <w:rPr>
                 <w:noProof/>
                 <w:webHidden/>
-                <w:color w:val="000000" w:themeColor="text1"/>
               </w:rPr>
               <w:fldChar w:fldCharType="end"/>
             </w:r>
@@ -1095,24 +1075,26 @@
               <w:tab w:val="right" w:leader="dot" w:pos="8656"/>
             </w:tabs>
             <w:rPr>
+              <w:rFonts w:asciiTheme="minorHAnsi" w:eastAsiaTheme="minorEastAsia" w:hAnsiTheme="minorHAnsi" w:cstheme="minorBidi"/>
               <w:noProof/>
-              <w:color w:val="000000" w:themeColor="text1"/>
+              <w:kern w:val="2"/>
+              <w14:ligatures w14:val="standardContextual"/>
             </w:rPr>
           </w:pPr>
-          <w:hyperlink w:anchor="_Toc235790506" w:history="1">
+          <w:hyperlink w:anchor="_Toc237516253" w:history="1">
             <w:r>
               <w:rPr>
                 <w:rStyle w:val="Lienhypertexte"/>
+                <w:b/>
+                <w:bCs/>
                 <w:noProof/>
-                <w:color w:val="000000" w:themeColor="text1"/>
-              </w:rPr>
-              <w:t>2.1 Methodes statistiques classiques</w:t>
+              </w:rPr>
+              <w:t>2.1 Méthodes statistiques classiques</w:t>
             </w:r>
             <w:r>
               <w:rPr>
                 <w:noProof/>
                 <w:webHidden/>
-                <w:color w:val="000000" w:themeColor="text1"/>
               </w:rPr>
               <w:tab/>
             </w:r>
@@ -1120,7 +1102,6 @@
               <w:rPr>
                 <w:noProof/>
                 <w:webHidden/>
-                <w:color w:val="000000" w:themeColor="text1"/>
               </w:rPr>
               <w:fldChar w:fldCharType="begin"/>
             </w:r>
@@ -1128,22 +1109,19 @@
               <w:rPr>
                 <w:noProof/>
                 <w:webHidden/>
-                <w:color w:val="000000" w:themeColor="text1"/>
-              </w:rPr>
-              <w:instrText xml:space="preserve"> PAGEREF _Toc235790506 \h </w:instrText>
+              </w:rPr>
+              <w:instrText xml:space="preserve"> PAGEREF _Toc237516253 \h </w:instrText>
             </w:r>
             <w:r>
               <w:rPr>
                 <w:noProof/>
                 <w:webHidden/>
-                <w:color w:val="000000" w:themeColor="text1"/>
               </w:rPr>
             </w:r>
             <w:r>
               <w:rPr>
                 <w:noProof/>
                 <w:webHidden/>
-                <w:color w:val="000000" w:themeColor="text1"/>
               </w:rPr>
               <w:fldChar w:fldCharType="separate"/>
             </w:r>
@@ -1151,15 +1129,13 @@
               <w:rPr>
                 <w:noProof/>
                 <w:webHidden/>
-                <w:color w:val="000000" w:themeColor="text1"/>
-              </w:rPr>
-              <w:t>5</w:t>
+              </w:rPr>
+              <w:t>6</w:t>
             </w:r>
             <w:r>
               <w:rPr>
                 <w:noProof/>
                 <w:webHidden/>
-                <w:color w:val="000000" w:themeColor="text1"/>
               </w:rPr>
               <w:fldChar w:fldCharType="end"/>
             </w:r>
@@ -1172,16 +1148,19 @@
               <w:tab w:val="right" w:leader="dot" w:pos="8656"/>
             </w:tabs>
             <w:rPr>
+              <w:rFonts w:asciiTheme="minorHAnsi" w:eastAsiaTheme="minorEastAsia" w:hAnsiTheme="minorHAnsi" w:cstheme="minorBidi"/>
               <w:noProof/>
-              <w:color w:val="000000" w:themeColor="text1"/>
+              <w:kern w:val="2"/>
+              <w14:ligatures w14:val="standardContextual"/>
             </w:rPr>
           </w:pPr>
-          <w:hyperlink w:anchor="_Toc235790507" w:history="1">
+          <w:hyperlink w:anchor="_Toc237516254" w:history="1">
             <w:r>
               <w:rPr>
                 <w:rStyle w:val="Lienhypertexte"/>
+                <w:b/>
+                <w:bCs/>
                 <w:noProof/>
-                <w:color w:val="000000" w:themeColor="text1"/>
               </w:rPr>
               <w:t>ARIMA / SARIMA</w:t>
             </w:r>
@@ -1189,7 +1168,6 @@
               <w:rPr>
                 <w:noProof/>
                 <w:webHidden/>
-                <w:color w:val="000000" w:themeColor="text1"/>
               </w:rPr>
               <w:tab/>
             </w:r>
@@ -1197,7 +1175,6 @@
               <w:rPr>
                 <w:noProof/>
                 <w:webHidden/>
-                <w:color w:val="000000" w:themeColor="text1"/>
               </w:rPr>
               <w:fldChar w:fldCharType="begin"/>
             </w:r>
@@ -1205,22 +1182,19 @@
               <w:rPr>
                 <w:noProof/>
                 <w:webHidden/>
-                <w:color w:val="000000" w:themeColor="text1"/>
-              </w:rPr>
-              <w:instrText xml:space="preserve"> PAGEREF _Toc235790507 \h </w:instrText>
+              </w:rPr>
+              <w:instrText xml:space="preserve"> PAGEREF _Toc237516254 \h </w:instrText>
             </w:r>
             <w:r>
               <w:rPr>
                 <w:noProof/>
                 <w:webHidden/>
-                <w:color w:val="000000" w:themeColor="text1"/>
               </w:rPr>
             </w:r>
             <w:r>
               <w:rPr>
                 <w:noProof/>
                 <w:webHidden/>
-                <w:color w:val="000000" w:themeColor="text1"/>
               </w:rPr>
               <w:fldChar w:fldCharType="separate"/>
             </w:r>
@@ -1228,15 +1202,13 @@
               <w:rPr>
                 <w:noProof/>
                 <w:webHidden/>
-                <w:color w:val="000000" w:themeColor="text1"/>
-              </w:rPr>
-              <w:t>5</w:t>
+              </w:rPr>
+              <w:t>6</w:t>
             </w:r>
             <w:r>
               <w:rPr>
                 <w:noProof/>
                 <w:webHidden/>
-                <w:color w:val="000000" w:themeColor="text1"/>
               </w:rPr>
               <w:fldChar w:fldCharType="end"/>
             </w:r>
@@ -1249,16 +1221,19 @@
               <w:tab w:val="right" w:leader="dot" w:pos="8656"/>
             </w:tabs>
             <w:rPr>
+              <w:rFonts w:asciiTheme="minorHAnsi" w:eastAsiaTheme="minorEastAsia" w:hAnsiTheme="minorHAnsi" w:cstheme="minorBidi"/>
               <w:noProof/>
-              <w:color w:val="000000" w:themeColor="text1"/>
+              <w:kern w:val="2"/>
+              <w14:ligatures w14:val="standardContextual"/>
             </w:rPr>
           </w:pPr>
-          <w:hyperlink w:anchor="_Toc235790508" w:history="1">
+          <w:hyperlink w:anchor="_Toc237516255" w:history="1">
             <w:r>
               <w:rPr>
                 <w:rStyle w:val="Lienhypertexte"/>
+                <w:b/>
+                <w:bCs/>
                 <w:noProof/>
-                <w:color w:val="000000" w:themeColor="text1"/>
               </w:rPr>
               <w:t>Holt-Winters (lissage exponentiel)</w:t>
             </w:r>
@@ -1266,7 +1241,6 @@
               <w:rPr>
                 <w:noProof/>
                 <w:webHidden/>
-                <w:color w:val="000000" w:themeColor="text1"/>
               </w:rPr>
               <w:tab/>
             </w:r>
@@ -1274,7 +1248,6 @@
               <w:rPr>
                 <w:noProof/>
                 <w:webHidden/>
-                <w:color w:val="000000" w:themeColor="text1"/>
               </w:rPr>
               <w:fldChar w:fldCharType="begin"/>
             </w:r>
@@ -1282,22 +1255,19 @@
               <w:rPr>
                 <w:noProof/>
                 <w:webHidden/>
-                <w:color w:val="000000" w:themeColor="text1"/>
-              </w:rPr>
-              <w:instrText xml:space="preserve"> PAGEREF _Toc235790508 \h </w:instrText>
+              </w:rPr>
+              <w:instrText xml:space="preserve"> PAGEREF _Toc237516255 \h </w:instrText>
             </w:r>
             <w:r>
               <w:rPr>
                 <w:noProof/>
                 <w:webHidden/>
-                <w:color w:val="000000" w:themeColor="text1"/>
               </w:rPr>
             </w:r>
             <w:r>
               <w:rPr>
                 <w:noProof/>
                 <w:webHidden/>
-                <w:color w:val="000000" w:themeColor="text1"/>
               </w:rPr>
               <w:fldChar w:fldCharType="separate"/>
             </w:r>
@@ -1305,15 +1275,13 @@
               <w:rPr>
                 <w:noProof/>
                 <w:webHidden/>
-                <w:color w:val="000000" w:themeColor="text1"/>
-              </w:rPr>
-              <w:t>5</w:t>
+              </w:rPr>
+              <w:t>7</w:t>
             </w:r>
             <w:r>
               <w:rPr>
                 <w:noProof/>
                 <w:webHidden/>
-                <w:color w:val="000000" w:themeColor="text1"/>
               </w:rPr>
               <w:fldChar w:fldCharType="end"/>
             </w:r>
@@ -1326,24 +1294,26 @@
               <w:tab w:val="right" w:leader="dot" w:pos="8656"/>
             </w:tabs>
             <w:rPr>
+              <w:rFonts w:asciiTheme="minorHAnsi" w:eastAsiaTheme="minorEastAsia" w:hAnsiTheme="minorHAnsi" w:cstheme="minorBidi"/>
               <w:noProof/>
-              <w:color w:val="000000" w:themeColor="text1"/>
+              <w:kern w:val="2"/>
+              <w14:ligatures w14:val="standardContextual"/>
             </w:rPr>
           </w:pPr>
-          <w:hyperlink w:anchor="_Toc235790509" w:history="1">
+          <w:hyperlink w:anchor="_Toc237516256" w:history="1">
             <w:r>
               <w:rPr>
                 <w:rStyle w:val="Lienhypertexte"/>
+                <w:b/>
+                <w:bCs/>
                 <w:noProof/>
-                <w:color w:val="000000" w:themeColor="text1"/>
-              </w:rPr>
-              <w:t>2.2 Approches Machine Learning</w:t>
+              </w:rPr>
+              <w:t>2.2 Deep Learning</w:t>
             </w:r>
             <w:r>
               <w:rPr>
                 <w:noProof/>
                 <w:webHidden/>
-                <w:color w:val="000000" w:themeColor="text1"/>
               </w:rPr>
               <w:tab/>
             </w:r>
@@ -1351,7 +1321,6 @@
               <w:rPr>
                 <w:noProof/>
                 <w:webHidden/>
-                <w:color w:val="000000" w:themeColor="text1"/>
               </w:rPr>
               <w:fldChar w:fldCharType="begin"/>
             </w:r>
@@ -1359,22 +1328,19 @@
               <w:rPr>
                 <w:noProof/>
                 <w:webHidden/>
-                <w:color w:val="000000" w:themeColor="text1"/>
-              </w:rPr>
-              <w:instrText xml:space="preserve"> PAGEREF _Toc235790509 \h </w:instrText>
+              </w:rPr>
+              <w:instrText xml:space="preserve"> PAGEREF _Toc237516256 \h </w:instrText>
             </w:r>
             <w:r>
               <w:rPr>
                 <w:noProof/>
                 <w:webHidden/>
-                <w:color w:val="000000" w:themeColor="text1"/>
               </w:rPr>
             </w:r>
             <w:r>
               <w:rPr>
                 <w:noProof/>
                 <w:webHidden/>
-                <w:color w:val="000000" w:themeColor="text1"/>
               </w:rPr>
               <w:fldChar w:fldCharType="separate"/>
             </w:r>
@@ -1382,15 +1348,13 @@
               <w:rPr>
                 <w:noProof/>
                 <w:webHidden/>
-                <w:color w:val="000000" w:themeColor="text1"/>
-              </w:rPr>
-              <w:t>6</w:t>
+              </w:rPr>
+              <w:t>7</w:t>
             </w:r>
             <w:r>
               <w:rPr>
                 <w:noProof/>
                 <w:webHidden/>
-                <w:color w:val="000000" w:themeColor="text1"/>
               </w:rPr>
               <w:fldChar w:fldCharType="end"/>
             </w:r>
@@ -1403,24 +1367,26 @@
               <w:tab w:val="right" w:leader="dot" w:pos="8656"/>
             </w:tabs>
             <w:rPr>
+              <w:rFonts w:asciiTheme="minorHAnsi" w:eastAsiaTheme="minorEastAsia" w:hAnsiTheme="minorHAnsi" w:cstheme="minorBidi"/>
               <w:noProof/>
-              <w:color w:val="000000" w:themeColor="text1"/>
+              <w:kern w:val="2"/>
+              <w14:ligatures w14:val="standardContextual"/>
             </w:rPr>
           </w:pPr>
-          <w:hyperlink w:anchor="_Toc235790510" w:history="1">
+          <w:hyperlink w:anchor="_Toc237516257" w:history="1">
             <w:r>
               <w:rPr>
                 <w:rStyle w:val="Lienhypertexte"/>
+                <w:b/>
+                <w:bCs/>
                 <w:noProof/>
-                <w:color w:val="000000" w:themeColor="text1"/>
-              </w:rPr>
-              <w:t>XGBoost et Random Forest sur features temporelles</w:t>
+              </w:rPr>
+              <w:t>LSTM (Long Short-Term Memory)</w:t>
             </w:r>
             <w:r>
               <w:rPr>
                 <w:noProof/>
                 <w:webHidden/>
-                <w:color w:val="000000" w:themeColor="text1"/>
               </w:rPr>
               <w:tab/>
             </w:r>
@@ -1428,7 +1394,6 @@
               <w:rPr>
                 <w:noProof/>
                 <w:webHidden/>
-                <w:color w:val="000000" w:themeColor="text1"/>
               </w:rPr>
               <w:fldChar w:fldCharType="begin"/>
             </w:r>
@@ -1436,22 +1401,19 @@
               <w:rPr>
                 <w:noProof/>
                 <w:webHidden/>
-                <w:color w:val="000000" w:themeColor="text1"/>
-              </w:rPr>
-              <w:instrText xml:space="preserve"> PAGEREF _Toc235790510 \h </w:instrText>
+              </w:rPr>
+              <w:instrText xml:space="preserve"> PAGEREF _Toc237516257 \h </w:instrText>
             </w:r>
             <w:r>
               <w:rPr>
                 <w:noProof/>
                 <w:webHidden/>
-                <w:color w:val="000000" w:themeColor="text1"/>
               </w:rPr>
             </w:r>
             <w:r>
               <w:rPr>
                 <w:noProof/>
                 <w:webHidden/>
-                <w:color w:val="000000" w:themeColor="text1"/>
               </w:rPr>
               <w:fldChar w:fldCharType="separate"/>
             </w:r>
@@ -1459,15 +1421,86 @@
               <w:rPr>
                 <w:noProof/>
                 <w:webHidden/>
-                <w:color w:val="000000" w:themeColor="text1"/>
-              </w:rPr>
-              <w:t>6</w:t>
+              </w:rPr>
+              <w:t>7</w:t>
             </w:r>
             <w:r>
               <w:rPr>
                 <w:noProof/>
                 <w:webHidden/>
-                <w:color w:val="000000" w:themeColor="text1"/>
+              </w:rPr>
+              <w:fldChar w:fldCharType="end"/>
+            </w:r>
+          </w:hyperlink>
+        </w:p>
+        <w:p>
+          <w:pPr>
+            <w:pStyle w:val="TM3"/>
+            <w:tabs>
+              <w:tab w:val="right" w:leader="dot" w:pos="8656"/>
+            </w:tabs>
+            <w:rPr>
+              <w:rFonts w:asciiTheme="minorHAnsi" w:eastAsiaTheme="minorEastAsia" w:hAnsiTheme="minorHAnsi" w:cstheme="minorBidi"/>
+              <w:noProof/>
+              <w:kern w:val="2"/>
+              <w14:ligatures w14:val="standardContextual"/>
+            </w:rPr>
+          </w:pPr>
+          <w:hyperlink w:anchor="_Toc237516258" w:history="1">
+            <w:r>
+              <w:rPr>
+                <w:rStyle w:val="Lienhypertexte"/>
+                <w:b/>
+                <w:bCs/>
+                <w:noProof/>
+              </w:rPr>
+              <w:t>Temporal Fusion Transformer (TFT)</w:t>
+            </w:r>
+            <w:r>
+              <w:rPr>
+                <w:noProof/>
+                <w:webHidden/>
+              </w:rPr>
+              <w:tab/>
+            </w:r>
+            <w:r>
+              <w:rPr>
+                <w:noProof/>
+                <w:webHidden/>
+              </w:rPr>
+              <w:fldChar w:fldCharType="begin"/>
+            </w:r>
+            <w:r>
+              <w:rPr>
+                <w:noProof/>
+                <w:webHidden/>
+              </w:rPr>
+              <w:instrText xml:space="preserve"> PAGEREF _Toc237516258 \h </w:instrText>
+            </w:r>
+            <w:r>
+              <w:rPr>
+                <w:noProof/>
+                <w:webHidden/>
+              </w:rPr>
+            </w:r>
+            <w:r>
+              <w:rPr>
+                <w:noProof/>
+                <w:webHidden/>
+              </w:rPr>
+              <w:fldChar w:fldCharType="separate"/>
+            </w:r>
+            <w:r>
+              <w:rPr>
+                <w:noProof/>
+                <w:webHidden/>
+              </w:rPr>
+              <w:t>8</w:t>
+            </w:r>
+            <w:r>
+              <w:rPr>
+                <w:noProof/>
+                <w:webHidden/>
               </w:rPr>
               <w:fldChar w:fldCharType="end"/>
             </w:r>
@@ -1480,24 +1513,26 @@
               <w:tab w:val="right" w:leader="dot" w:pos="8656"/>
             </w:tabs>
             <w:rPr>
+              <w:rFonts w:asciiTheme="minorHAnsi" w:eastAsiaTheme="minorEastAsia" w:hAnsiTheme="minorHAnsi" w:cstheme="minorBidi"/>
               <w:noProof/>
-              <w:color w:val="000000" w:themeColor="text1"/>
+              <w:kern w:val="2"/>
+              <w14:ligatures w14:val="standardContextual"/>
             </w:rPr>
           </w:pPr>
-          <w:hyperlink w:anchor="_Toc235790511" w:history="1">
+          <w:hyperlink w:anchor="_Toc237516259" w:history="1">
             <w:r>
               <w:rPr>
                 <w:rStyle w:val="Lienhypertexte"/>
+                <w:b/>
+                <w:bCs/>
                 <w:noProof/>
-                <w:color w:val="000000" w:themeColor="text1"/>
-              </w:rPr>
-              <w:t>2.3 Deep Learning</w:t>
+              </w:rPr>
+              <w:t>2.3 Méthodes bayésiennes : Prophet (Meta) - RETENU</w:t>
             </w:r>
             <w:r>
               <w:rPr>
                 <w:noProof/>
                 <w:webHidden/>
-                <w:color w:val="000000" w:themeColor="text1"/>
               </w:rPr>
               <w:tab/>
             </w:r>
@@ -1505,7 +1540,6 @@
               <w:rPr>
                 <w:noProof/>
                 <w:webHidden/>
-                <w:color w:val="000000" w:themeColor="text1"/>
               </w:rPr>
               <w:fldChar w:fldCharType="begin"/>
             </w:r>
@@ -1513,22 +1547,19 @@
               <w:rPr>
                 <w:noProof/>
                 <w:webHidden/>
-                <w:color w:val="000000" w:themeColor="text1"/>
-              </w:rPr>
-              <w:instrText xml:space="preserve"> PAGEREF _Toc235790511 \h </w:instrText>
+              </w:rPr>
+              <w:instrText xml:space="preserve"> PAGEREF _Toc237516259 \h </w:instrText>
             </w:r>
             <w:r>
               <w:rPr>
                 <w:noProof/>
                 <w:webHidden/>
-                <w:color w:val="000000" w:themeColor="text1"/>
               </w:rPr>
             </w:r>
             <w:r>
               <w:rPr>
                 <w:noProof/>
                 <w:webHidden/>
-                <w:color w:val="000000" w:themeColor="text1"/>
               </w:rPr>
               <w:fldChar w:fldCharType="separate"/>
             </w:r>
@@ -1536,15 +1567,13 @@
               <w:rPr>
                 <w:noProof/>
                 <w:webHidden/>
-                <w:color w:val="000000" w:themeColor="text1"/>
-              </w:rPr>
-              <w:t>7</w:t>
+              </w:rPr>
+              <w:t>9</w:t>
             </w:r>
             <w:r>
               <w:rPr>
                 <w:noProof/>
                 <w:webHidden/>
-                <w:color w:val="000000" w:themeColor="text1"/>
               </w:rPr>
               <w:fldChar w:fldCharType="end"/>
             </w:r>
@@ -1552,29 +1581,31 @@
         </w:p>
         <w:p>
           <w:pPr>
-            <w:pStyle w:val="TM3"/>
+            <w:pStyle w:val="TM1"/>
             <w:tabs>
               <w:tab w:val="right" w:leader="dot" w:pos="8656"/>
             </w:tabs>
             <w:rPr>
+              <w:rFonts w:asciiTheme="minorHAnsi" w:eastAsiaTheme="minorEastAsia" w:hAnsiTheme="minorHAnsi" w:cstheme="minorBidi"/>
               <w:noProof/>
-              <w:color w:val="000000" w:themeColor="text1"/>
+              <w:kern w:val="2"/>
+              <w14:ligatures w14:val="standardContextual"/>
             </w:rPr>
           </w:pPr>
-          <w:hyperlink w:anchor="_Toc235790512" w:history="1">
+          <w:hyperlink w:anchor="_Toc237516260" w:history="1">
             <w:r>
               <w:rPr>
                 <w:rStyle w:val="Lienhypertexte"/>
+                <w:b/>
+                <w:bCs/>
                 <w:noProof/>
-                <w:color w:val="000000" w:themeColor="text1"/>
-              </w:rPr>
-              <w:t>LSTM (Long Short-Term Memory)</w:t>
+              </w:rPr>
+              <w:t>3. Tableau comparatif des outils et librairies</w:t>
             </w:r>
             <w:r>
               <w:rPr>
                 <w:noProof/>
                 <w:webHidden/>
-                <w:color w:val="000000" w:themeColor="text1"/>
               </w:rPr>
               <w:tab/>
             </w:r>
@@ -1582,7 +1613,6 @@
               <w:rPr>
                 <w:noProof/>
                 <w:webHidden/>
-                <w:color w:val="000000" w:themeColor="text1"/>
               </w:rPr>
               <w:fldChar w:fldCharType="begin"/>
             </w:r>
@@ -1590,22 +1620,19 @@
               <w:rPr>
                 <w:noProof/>
                 <w:webHidden/>
-                <w:color w:val="000000" w:themeColor="text1"/>
-              </w:rPr>
-              <w:instrText xml:space="preserve"> PAGEREF _Toc235790512 \h </w:instrText>
+              </w:rPr>
+              <w:instrText xml:space="preserve"> PAGEREF _Toc237516260 \h </w:instrText>
             </w:r>
             <w:r>
               <w:rPr>
                 <w:noProof/>
                 <w:webHidden/>
-                <w:color w:val="000000" w:themeColor="text1"/>
               </w:rPr>
             </w:r>
             <w:r>
               <w:rPr>
                 <w:noProof/>
                 <w:webHidden/>
-                <w:color w:val="000000" w:themeColor="text1"/>
               </w:rPr>
               <w:fldChar w:fldCharType="separate"/>
             </w:r>
@@ -1613,15 +1640,13 @@
               <w:rPr>
                 <w:noProof/>
                 <w:webHidden/>
-                <w:color w:val="000000" w:themeColor="text1"/>
-              </w:rPr>
-              <w:t>7</w:t>
+              </w:rPr>
+              <w:t>10</w:t>
             </w:r>
             <w:r>
               <w:rPr>
                 <w:noProof/>
                 <w:webHidden/>
-                <w:color w:val="000000" w:themeColor="text1"/>
               </w:rPr>
               <w:fldChar w:fldCharType="end"/>
             </w:r>
@@ -1629,29 +1654,31 @@
         </w:p>
         <w:p>
           <w:pPr>
-            <w:pStyle w:val="TM3"/>
+            <w:pStyle w:val="TM1"/>
             <w:tabs>
               <w:tab w:val="right" w:leader="dot" w:pos="8656"/>
             </w:tabs>
             <w:rPr>
+              <w:rFonts w:asciiTheme="minorHAnsi" w:eastAsiaTheme="minorEastAsia" w:hAnsiTheme="minorHAnsi" w:cstheme="minorBidi"/>
               <w:noProof/>
-              <w:color w:val="000000" w:themeColor="text1"/>
+              <w:kern w:val="2"/>
+              <w14:ligatures w14:val="standardContextual"/>
             </w:rPr>
           </w:pPr>
-          <w:hyperlink w:anchor="_Toc235790513" w:history="1">
+          <w:hyperlink w:anchor="_Toc237516261" w:history="1">
             <w:r>
               <w:rPr>
                 <w:rStyle w:val="Lienhypertexte"/>
+                <w:b/>
+                <w:bCs/>
                 <w:noProof/>
-                <w:color w:val="000000" w:themeColor="text1"/>
-              </w:rPr>
-              <w:t>Temporal Fusion Transformer (TFT)</w:t>
+              </w:rPr>
+              <w:t>4. Etat de l'art - Prédiction de l'inflation par les institutions</w:t>
             </w:r>
             <w:r>
               <w:rPr>
                 <w:noProof/>
                 <w:webHidden/>
-                <w:color w:val="000000" w:themeColor="text1"/>
               </w:rPr>
               <w:tab/>
             </w:r>
@@ -1659,7 +1686,6 @@
               <w:rPr>
                 <w:noProof/>
                 <w:webHidden/>
-                <w:color w:val="000000" w:themeColor="text1"/>
               </w:rPr>
               <w:fldChar w:fldCharType="begin"/>
             </w:r>
@@ -1667,22 +1693,19 @@
               <w:rPr>
                 <w:noProof/>
                 <w:webHidden/>
-                <w:color w:val="000000" w:themeColor="text1"/>
-              </w:rPr>
-              <w:instrText xml:space="preserve"> PAGEREF _Toc235790513 \h </w:instrText>
+              </w:rPr>
+              <w:instrText xml:space="preserve"> PAGEREF _Toc237516261 \h </w:instrText>
             </w:r>
             <w:r>
               <w:rPr>
                 <w:noProof/>
                 <w:webHidden/>
-                <w:color w:val="000000" w:themeColor="text1"/>
               </w:rPr>
             </w:r>
             <w:r>
               <w:rPr>
                 <w:noProof/>
                 <w:webHidden/>
-                <w:color w:val="000000" w:themeColor="text1"/>
               </w:rPr>
               <w:fldChar w:fldCharType="separate"/>
             </w:r>
@@ -1690,15 +1713,13 @@
               <w:rPr>
                 <w:noProof/>
                 <w:webHidden/>
-                <w:color w:val="000000" w:themeColor="text1"/>
-              </w:rPr>
-              <w:t>7</w:t>
+              </w:rPr>
+              <w:t>11</w:t>
             </w:r>
             <w:r>
               <w:rPr>
                 <w:noProof/>
                 <w:webHidden/>
-                <w:color w:val="000000" w:themeColor="text1"/>
               </w:rPr>
               <w:fldChar w:fldCharType="end"/>
             </w:r>
@@ -1711,24 +1732,26 @@
               <w:tab w:val="right" w:leader="dot" w:pos="8656"/>
             </w:tabs>
             <w:rPr>
+              <w:rFonts w:asciiTheme="minorHAnsi" w:eastAsiaTheme="minorEastAsia" w:hAnsiTheme="minorHAnsi" w:cstheme="minorBidi"/>
               <w:noProof/>
-              <w:color w:val="000000" w:themeColor="text1"/>
+              <w:kern w:val="2"/>
+              <w14:ligatures w14:val="standardContextual"/>
             </w:rPr>
           </w:pPr>
-          <w:hyperlink w:anchor="_Toc235790514" w:history="1">
+          <w:hyperlink w:anchor="_Toc237516262" w:history="1">
             <w:r>
               <w:rPr>
                 <w:rStyle w:val="Lienhypertexte"/>
+                <w:b/>
+                <w:bCs/>
                 <w:noProof/>
-                <w:color w:val="000000" w:themeColor="text1"/>
-              </w:rPr>
-              <w:t>2.4 Methodes bayesiennes : Prophet (Meta) - RETENU</w:t>
+              </w:rPr>
+              <w:t>4.1 Banque Centrale Européenne : modelés DSGE</w:t>
             </w:r>
             <w:r>
               <w:rPr>
                 <w:noProof/>
                 <w:webHidden/>
-                <w:color w:val="000000" w:themeColor="text1"/>
               </w:rPr>
               <w:tab/>
             </w:r>
@@ -1736,7 +1759,6 @@
               <w:rPr>
                 <w:noProof/>
                 <w:webHidden/>
-                <w:color w:val="000000" w:themeColor="text1"/>
               </w:rPr>
               <w:fldChar w:fldCharType="begin"/>
             </w:r>
@@ -1744,22 +1766,19 @@
               <w:rPr>
                 <w:noProof/>
                 <w:webHidden/>
-                <w:color w:val="000000" w:themeColor="text1"/>
-              </w:rPr>
-              <w:instrText xml:space="preserve"> PAGEREF _Toc235790514 \h </w:instrText>
+              </w:rPr>
+              <w:instrText xml:space="preserve"> PAGEREF _Toc237516262 \h </w:instrText>
             </w:r>
             <w:r>
               <w:rPr>
                 <w:noProof/>
                 <w:webHidden/>
-                <w:color w:val="000000" w:themeColor="text1"/>
               </w:rPr>
             </w:r>
             <w:r>
               <w:rPr>
                 <w:noProof/>
                 <w:webHidden/>
-                <w:color w:val="000000" w:themeColor="text1"/>
               </w:rPr>
               <w:fldChar w:fldCharType="separate"/>
             </w:r>
@@ -1767,15 +1786,232 @@
               <w:rPr>
                 <w:noProof/>
                 <w:webHidden/>
-                <w:color w:val="000000" w:themeColor="text1"/>
-              </w:rPr>
-              <w:t>8</w:t>
+              </w:rPr>
+              <w:t>11</w:t>
             </w:r>
             <w:r>
               <w:rPr>
                 <w:noProof/>
                 <w:webHidden/>
-                <w:color w:val="000000" w:themeColor="text1"/>
+              </w:rPr>
+              <w:fldChar w:fldCharType="end"/>
+            </w:r>
+          </w:hyperlink>
+        </w:p>
+        <w:p>
+          <w:pPr>
+            <w:pStyle w:val="TM2"/>
+            <w:tabs>
+              <w:tab w:val="right" w:leader="dot" w:pos="8656"/>
+            </w:tabs>
+            <w:rPr>
+              <w:rFonts w:asciiTheme="minorHAnsi" w:eastAsiaTheme="minorEastAsia" w:hAnsiTheme="minorHAnsi" w:cstheme="minorBidi"/>
+              <w:noProof/>
+              <w:kern w:val="2"/>
+              <w14:ligatures w14:val="standardContextual"/>
+            </w:rPr>
+          </w:pPr>
+          <w:hyperlink w:anchor="_Toc237516263" w:history="1">
+            <w:r>
+              <w:rPr>
+                <w:rStyle w:val="Lienhypertexte"/>
+                <w:b/>
+                <w:bCs/>
+                <w:noProof/>
+              </w:rPr>
+              <w:t>4.2 INSEE : méthodes de déflation et prévisions à court terme</w:t>
+            </w:r>
+            <w:r>
+              <w:rPr>
+                <w:noProof/>
+                <w:webHidden/>
+              </w:rPr>
+              <w:tab/>
+            </w:r>
+            <w:r>
+              <w:rPr>
+                <w:noProof/>
+                <w:webHidden/>
+              </w:rPr>
+              <w:fldChar w:fldCharType="begin"/>
+            </w:r>
+            <w:r>
+              <w:rPr>
+                <w:noProof/>
+                <w:webHidden/>
+              </w:rPr>
+              <w:instrText xml:space="preserve"> PAGEREF _Toc237516263 \h </w:instrText>
+            </w:r>
+            <w:r>
+              <w:rPr>
+                <w:noProof/>
+                <w:webHidden/>
+              </w:rPr>
+            </w:r>
+            <w:r>
+              <w:rPr>
+                <w:noProof/>
+                <w:webHidden/>
+              </w:rPr>
+              <w:fldChar w:fldCharType="separate"/>
+            </w:r>
+            <w:r>
+              <w:rPr>
+                <w:noProof/>
+                <w:webHidden/>
+              </w:rPr>
+              <w:t>11</w:t>
+            </w:r>
+            <w:r>
+              <w:rPr>
+                <w:noProof/>
+                <w:webHidden/>
+              </w:rPr>
+              <w:fldChar w:fldCharType="end"/>
+            </w:r>
+          </w:hyperlink>
+        </w:p>
+        <w:p>
+          <w:pPr>
+            <w:pStyle w:val="TM2"/>
+            <w:tabs>
+              <w:tab w:val="right" w:leader="dot" w:pos="8656"/>
+            </w:tabs>
+            <w:rPr>
+              <w:rFonts w:asciiTheme="minorHAnsi" w:eastAsiaTheme="minorEastAsia" w:hAnsiTheme="minorHAnsi" w:cstheme="minorBidi"/>
+              <w:noProof/>
+              <w:kern w:val="2"/>
+              <w14:ligatures w14:val="standardContextual"/>
+            </w:rPr>
+          </w:pPr>
+          <w:hyperlink w:anchor="_Toc237516264" w:history="1">
+            <w:r>
+              <w:rPr>
+                <w:rStyle w:val="Lienhypertexte"/>
+                <w:b/>
+                <w:bCs/>
+                <w:noProof/>
+              </w:rPr>
+              <w:t>4.3 Travaux académiques récents sur Prophet et les séries macro-économiques</w:t>
+            </w:r>
+            <w:r>
+              <w:rPr>
+                <w:noProof/>
+                <w:webHidden/>
+              </w:rPr>
+              <w:tab/>
+            </w:r>
+            <w:r>
+              <w:rPr>
+                <w:noProof/>
+                <w:webHidden/>
+              </w:rPr>
+              <w:fldChar w:fldCharType="begin"/>
+            </w:r>
+            <w:r>
+              <w:rPr>
+                <w:noProof/>
+                <w:webHidden/>
+              </w:rPr>
+              <w:instrText xml:space="preserve"> PAGEREF _Toc237516264 \h </w:instrText>
+            </w:r>
+            <w:r>
+              <w:rPr>
+                <w:noProof/>
+                <w:webHidden/>
+              </w:rPr>
+            </w:r>
+            <w:r>
+              <w:rPr>
+                <w:noProof/>
+                <w:webHidden/>
+              </w:rPr>
+              <w:fldChar w:fldCharType="separate"/>
+            </w:r>
+            <w:r>
+              <w:rPr>
+                <w:noProof/>
+                <w:webHidden/>
+              </w:rPr>
+              <w:t>12</w:t>
+            </w:r>
+            <w:r>
+              <w:rPr>
+                <w:noProof/>
+                <w:webHidden/>
+              </w:rPr>
+              <w:fldChar w:fldCharType="end"/>
+            </w:r>
+          </w:hyperlink>
+        </w:p>
+        <w:p>
+          <w:pPr>
+            <w:pStyle w:val="TM2"/>
+            <w:tabs>
+              <w:tab w:val="right" w:leader="dot" w:pos="8656"/>
+            </w:tabs>
+            <w:rPr>
+              <w:rFonts w:asciiTheme="minorHAnsi" w:eastAsiaTheme="minorEastAsia" w:hAnsiTheme="minorHAnsi" w:cstheme="minorBidi"/>
+              <w:noProof/>
+              <w:kern w:val="2"/>
+              <w14:ligatures w14:val="standardContextual"/>
+            </w:rPr>
+          </w:pPr>
+          <w:hyperlink w:anchor="_Toc237516265" w:history="1">
+            <w:r>
+              <w:rPr>
+                <w:rStyle w:val="Lienhypertexte"/>
+                <w:b/>
+                <w:bCs/>
+                <w:noProof/>
+              </w:rPr>
+              <w:t>4.4 Limites des modèles face aux chocs exogènes</w:t>
+            </w:r>
+            <w:r>
+              <w:rPr>
+                <w:noProof/>
+                <w:webHidden/>
+              </w:rPr>
+              <w:tab/>
+            </w:r>
+            <w:r>
+              <w:rPr>
+                <w:noProof/>
+                <w:webHidden/>
+              </w:rPr>
+              <w:fldChar w:fldCharType="begin"/>
+            </w:r>
+            <w:r>
+              <w:rPr>
+                <w:noProof/>
+                <w:webHidden/>
+              </w:rPr>
+              <w:instrText xml:space="preserve"> PAGEREF _Toc237516265 \h </w:instrText>
+            </w:r>
+            <w:r>
+              <w:rPr>
+                <w:noProof/>
+                <w:webHidden/>
+              </w:rPr>
+            </w:r>
+            <w:r>
+              <w:rPr>
+                <w:noProof/>
+                <w:webHidden/>
+              </w:rPr>
+              <w:fldChar w:fldCharType="separate"/>
+            </w:r>
+            <w:r>
+              <w:rPr>
+                <w:noProof/>
+                <w:webHidden/>
+              </w:rPr>
+              <w:t>12</w:t>
+            </w:r>
+            <w:r>
+              <w:rPr>
+                <w:noProof/>
+                <w:webHidden/>
               </w:rPr>
               <w:fldChar w:fldCharType="end"/>
             </w:r>
@@ -1788,24 +2024,26 @@
               <w:tab w:val="right" w:leader="dot" w:pos="8656"/>
             </w:tabs>
             <w:rPr>
+              <w:rFonts w:asciiTheme="minorHAnsi" w:eastAsiaTheme="minorEastAsia" w:hAnsiTheme="minorHAnsi" w:cstheme="minorBidi"/>
               <w:noProof/>
-              <w:color w:val="000000" w:themeColor="text1"/>
+              <w:kern w:val="2"/>
+              <w14:ligatures w14:val="standardContextual"/>
             </w:rPr>
           </w:pPr>
-          <w:hyperlink w:anchor="_Toc235790515" w:history="1">
+          <w:hyperlink w:anchor="_Toc237516266" w:history="1">
             <w:r>
               <w:rPr>
                 <w:rStyle w:val="Lienhypertexte"/>
+                <w:b/>
+                <w:bCs/>
                 <w:noProof/>
-                <w:color w:val="000000" w:themeColor="text1"/>
-              </w:rPr>
-              <w:t>3. Tableau comparatif des outils et librairies</w:t>
+              </w:rPr>
+              <w:t>5. Justification du choix technologique</w:t>
             </w:r>
             <w:r>
               <w:rPr>
                 <w:noProof/>
                 <w:webHidden/>
-                <w:color w:val="000000" w:themeColor="text1"/>
               </w:rPr>
               <w:tab/>
             </w:r>
@@ -1813,7 +2051,6 @@
               <w:rPr>
                 <w:noProof/>
                 <w:webHidden/>
-                <w:color w:val="000000" w:themeColor="text1"/>
               </w:rPr>
               <w:fldChar w:fldCharType="begin"/>
             </w:r>
@@ -1821,22 +2058,19 @@
               <w:rPr>
                 <w:noProof/>
                 <w:webHidden/>
-                <w:color w:val="000000" w:themeColor="text1"/>
-              </w:rPr>
-              <w:instrText xml:space="preserve"> PAGEREF _Toc235790515 \h </w:instrText>
+              </w:rPr>
+              <w:instrText xml:space="preserve"> PAGEREF _Toc237516266 \h </w:instrText>
             </w:r>
             <w:r>
               <w:rPr>
                 <w:noProof/>
                 <w:webHidden/>
-                <w:color w:val="000000" w:themeColor="text1"/>
               </w:rPr>
             </w:r>
             <w:r>
               <w:rPr>
                 <w:noProof/>
                 <w:webHidden/>
-                <w:color w:val="000000" w:themeColor="text1"/>
               </w:rPr>
               <w:fldChar w:fldCharType="separate"/>
             </w:r>
@@ -1844,15 +2078,232 @@
               <w:rPr>
                 <w:noProof/>
                 <w:webHidden/>
-                <w:color w:val="000000" w:themeColor="text1"/>
-              </w:rPr>
-              <w:t>10</w:t>
+              </w:rPr>
+              <w:t>14</w:t>
             </w:r>
             <w:r>
               <w:rPr>
                 <w:noProof/>
                 <w:webHidden/>
-                <w:color w:val="000000" w:themeColor="text1"/>
+              </w:rPr>
+              <w:fldChar w:fldCharType="end"/>
+            </w:r>
+          </w:hyperlink>
+        </w:p>
+        <w:p>
+          <w:pPr>
+            <w:pStyle w:val="TM2"/>
+            <w:tabs>
+              <w:tab w:val="right" w:leader="dot" w:pos="8656"/>
+            </w:tabs>
+            <w:rPr>
+              <w:rFonts w:asciiTheme="minorHAnsi" w:eastAsiaTheme="minorEastAsia" w:hAnsiTheme="minorHAnsi" w:cstheme="minorBidi"/>
+              <w:noProof/>
+              <w:kern w:val="2"/>
+              <w14:ligatures w14:val="standardContextual"/>
+            </w:rPr>
+          </w:pPr>
+          <w:hyperlink w:anchor="_Toc237516267" w:history="1">
+            <w:r>
+              <w:rPr>
+                <w:rStyle w:val="Lienhypertexte"/>
+                <w:b/>
+                <w:bCs/>
+                <w:noProof/>
+              </w:rPr>
+              <w:t>5.1 Prophet retenu : analyse des critères</w:t>
+            </w:r>
+            <w:r>
+              <w:rPr>
+                <w:noProof/>
+                <w:webHidden/>
+              </w:rPr>
+              <w:tab/>
+            </w:r>
+            <w:r>
+              <w:rPr>
+                <w:noProof/>
+                <w:webHidden/>
+              </w:rPr>
+              <w:fldChar w:fldCharType="begin"/>
+            </w:r>
+            <w:r>
+              <w:rPr>
+                <w:noProof/>
+                <w:webHidden/>
+              </w:rPr>
+              <w:instrText xml:space="preserve"> PAGEREF _Toc237516267 \h </w:instrText>
+            </w:r>
+            <w:r>
+              <w:rPr>
+                <w:noProof/>
+                <w:webHidden/>
+              </w:rPr>
+            </w:r>
+            <w:r>
+              <w:rPr>
+                <w:noProof/>
+                <w:webHidden/>
+              </w:rPr>
+              <w:fldChar w:fldCharType="separate"/>
+            </w:r>
+            <w:r>
+              <w:rPr>
+                <w:noProof/>
+                <w:webHidden/>
+              </w:rPr>
+              <w:t>14</w:t>
+            </w:r>
+            <w:r>
+              <w:rPr>
+                <w:noProof/>
+                <w:webHidden/>
+              </w:rPr>
+              <w:fldChar w:fldCharType="end"/>
+            </w:r>
+          </w:hyperlink>
+        </w:p>
+        <w:p>
+          <w:pPr>
+            <w:pStyle w:val="TM2"/>
+            <w:tabs>
+              <w:tab w:val="right" w:leader="dot" w:pos="8656"/>
+            </w:tabs>
+            <w:rPr>
+              <w:rFonts w:asciiTheme="minorHAnsi" w:eastAsiaTheme="minorEastAsia" w:hAnsiTheme="minorHAnsi" w:cstheme="minorBidi"/>
+              <w:noProof/>
+              <w:kern w:val="2"/>
+              <w14:ligatures w14:val="standardContextual"/>
+            </w:rPr>
+          </w:pPr>
+          <w:hyperlink w:anchor="_Toc237516268" w:history="1">
+            <w:r>
+              <w:rPr>
+                <w:rStyle w:val="Lienhypertexte"/>
+                <w:b/>
+                <w:bCs/>
+                <w:noProof/>
+              </w:rPr>
+              <w:t>5.2 LSTM écarté : justification</w:t>
+            </w:r>
+            <w:r>
+              <w:rPr>
+                <w:noProof/>
+                <w:webHidden/>
+              </w:rPr>
+              <w:tab/>
+            </w:r>
+            <w:r>
+              <w:rPr>
+                <w:noProof/>
+                <w:webHidden/>
+              </w:rPr>
+              <w:fldChar w:fldCharType="begin"/>
+            </w:r>
+            <w:r>
+              <w:rPr>
+                <w:noProof/>
+                <w:webHidden/>
+              </w:rPr>
+              <w:instrText xml:space="preserve"> PAGEREF _Toc237516268 \h </w:instrText>
+            </w:r>
+            <w:r>
+              <w:rPr>
+                <w:noProof/>
+                <w:webHidden/>
+              </w:rPr>
+            </w:r>
+            <w:r>
+              <w:rPr>
+                <w:noProof/>
+                <w:webHidden/>
+              </w:rPr>
+              <w:fldChar w:fldCharType="separate"/>
+            </w:r>
+            <w:r>
+              <w:rPr>
+                <w:noProof/>
+                <w:webHidden/>
+              </w:rPr>
+              <w:t>16</w:t>
+            </w:r>
+            <w:r>
+              <w:rPr>
+                <w:noProof/>
+                <w:webHidden/>
+              </w:rPr>
+              <w:fldChar w:fldCharType="end"/>
+            </w:r>
+          </w:hyperlink>
+        </w:p>
+        <w:p>
+          <w:pPr>
+            <w:pStyle w:val="TM2"/>
+            <w:tabs>
+              <w:tab w:val="right" w:leader="dot" w:pos="8656"/>
+            </w:tabs>
+            <w:rPr>
+              <w:rFonts w:asciiTheme="minorHAnsi" w:eastAsiaTheme="minorEastAsia" w:hAnsiTheme="minorHAnsi" w:cstheme="minorBidi"/>
+              <w:noProof/>
+              <w:kern w:val="2"/>
+              <w14:ligatures w14:val="standardContextual"/>
+            </w:rPr>
+          </w:pPr>
+          <w:hyperlink w:anchor="_Toc237516269" w:history="1">
+            <w:r>
+              <w:rPr>
+                <w:rStyle w:val="Lienhypertexte"/>
+                <w:b/>
+                <w:bCs/>
+                <w:noProof/>
+              </w:rPr>
+              <w:t>5.3 ARIMA écarté : justification</w:t>
+            </w:r>
+            <w:r>
+              <w:rPr>
+                <w:noProof/>
+                <w:webHidden/>
+              </w:rPr>
+              <w:tab/>
+            </w:r>
+            <w:r>
+              <w:rPr>
+                <w:noProof/>
+                <w:webHidden/>
+              </w:rPr>
+              <w:fldChar w:fldCharType="begin"/>
+            </w:r>
+            <w:r>
+              <w:rPr>
+                <w:noProof/>
+                <w:webHidden/>
+              </w:rPr>
+              <w:instrText xml:space="preserve"> PAGEREF _Toc237516269 \h </w:instrText>
+            </w:r>
+            <w:r>
+              <w:rPr>
+                <w:noProof/>
+                <w:webHidden/>
+              </w:rPr>
+            </w:r>
+            <w:r>
+              <w:rPr>
+                <w:noProof/>
+                <w:webHidden/>
+              </w:rPr>
+              <w:fldChar w:fldCharType="separate"/>
+            </w:r>
+            <w:r>
+              <w:rPr>
+                <w:noProof/>
+                <w:webHidden/>
+              </w:rPr>
+              <w:t>16</w:t>
+            </w:r>
+            <w:r>
+              <w:rPr>
+                <w:noProof/>
+                <w:webHidden/>
               </w:rPr>
               <w:fldChar w:fldCharType="end"/>
             </w:r>
@@ -1865,24 +2316,26 @@
               <w:tab w:val="right" w:leader="dot" w:pos="8656"/>
             </w:tabs>
             <w:rPr>
+              <w:rFonts w:asciiTheme="minorHAnsi" w:eastAsiaTheme="minorEastAsia" w:hAnsiTheme="minorHAnsi" w:cstheme="minorBidi"/>
               <w:noProof/>
-              <w:color w:val="000000" w:themeColor="text1"/>
+              <w:kern w:val="2"/>
+              <w14:ligatures w14:val="standardContextual"/>
             </w:rPr>
           </w:pPr>
-          <w:hyperlink w:anchor="_Toc235790516" w:history="1">
+          <w:hyperlink w:anchor="_Toc237516270" w:history="1">
             <w:r>
               <w:rPr>
                 <w:rStyle w:val="Lienhypertexte"/>
+                <w:b/>
+                <w:bCs/>
                 <w:noProof/>
-                <w:color w:val="000000" w:themeColor="text1"/>
-              </w:rPr>
-              <w:t>4. Etat de l'art - Prediction de l'inflation par les institutions</w:t>
+              </w:rPr>
+              <w:t>6. Sources et références</w:t>
             </w:r>
             <w:r>
               <w:rPr>
                 <w:noProof/>
                 <w:webHidden/>
-                <w:color w:val="000000" w:themeColor="text1"/>
               </w:rPr>
               <w:tab/>
             </w:r>
@@ -1890,7 +2343,6 @@
               <w:rPr>
                 <w:noProof/>
                 <w:webHidden/>
-                <w:color w:val="000000" w:themeColor="text1"/>
               </w:rPr>
               <w:fldChar w:fldCharType="begin"/>
             </w:r>
@@ -1898,22 +2350,19 @@
               <w:rPr>
                 <w:noProof/>
                 <w:webHidden/>
-                <w:color w:val="000000" w:themeColor="text1"/>
-              </w:rPr>
-              <w:instrText xml:space="preserve"> PAGEREF _Toc235790516 \h </w:instrText>
+              </w:rPr>
+              <w:instrText xml:space="preserve"> PAGEREF _Toc237516270 \h </w:instrText>
             </w:r>
             <w:r>
               <w:rPr>
                 <w:noProof/>
                 <w:webHidden/>
-                <w:color w:val="000000" w:themeColor="text1"/>
               </w:rPr>
             </w:r>
             <w:r>
               <w:rPr>
                 <w:noProof/>
                 <w:webHidden/>
-                <w:color w:val="000000" w:themeColor="text1"/>
               </w:rPr>
               <w:fldChar w:fldCharType="separate"/>
             </w:r>
@@ -1921,708 +2370,13 @@
               <w:rPr>
                 <w:noProof/>
                 <w:webHidden/>
-                <w:color w:val="000000" w:themeColor="text1"/>
-              </w:rPr>
-              <w:t>11</w:t>
+              </w:rPr>
+              <w:t>17</w:t>
             </w:r>
             <w:r>
               <w:rPr>
                 <w:noProof/>
                 <w:webHidden/>
-                <w:color w:val="000000" w:themeColor="text1"/>
-              </w:rPr>
-              <w:fldChar w:fldCharType="end"/>
-            </w:r>
-          </w:hyperlink>
-        </w:p>
-        <w:p>
-          <w:pPr>
-            <w:pStyle w:val="TM2"/>
-            <w:tabs>
-              <w:tab w:val="right" w:leader="dot" w:pos="8656"/>
-            </w:tabs>
-            <w:rPr>
-              <w:noProof/>
-              <w:color w:val="000000" w:themeColor="text1"/>
-            </w:rPr>
-          </w:pPr>
-          <w:hyperlink w:anchor="_Toc235790517" w:history="1">
-            <w:r>
-              <w:rPr>
-                <w:rStyle w:val="Lienhypertexte"/>
-                <w:noProof/>
-                <w:color w:val="000000" w:themeColor="text1"/>
-              </w:rPr>
-              <w:t>4.1 Banque Centrale Europeenne : modeles DSGE</w:t>
-            </w:r>
-            <w:r>
-              <w:rPr>
-                <w:noProof/>
-                <w:webHidden/>
-                <w:color w:val="000000" w:themeColor="text1"/>
-              </w:rPr>
-              <w:tab/>
-            </w:r>
-            <w:r>
-              <w:rPr>
-                <w:noProof/>
-                <w:webHidden/>
-                <w:color w:val="000000" w:themeColor="text1"/>
-              </w:rPr>
-              <w:fldChar w:fldCharType="begin"/>
-            </w:r>
-            <w:r>
-              <w:rPr>
-                <w:noProof/>
-                <w:webHidden/>
-                <w:color w:val="000000" w:themeColor="text1"/>
-              </w:rPr>
-              <w:instrText xml:space="preserve"> PAGEREF _Toc235790517 \h </w:instrText>
-            </w:r>
-            <w:r>
-              <w:rPr>
-                <w:noProof/>
-                <w:webHidden/>
-                <w:color w:val="000000" w:themeColor="text1"/>
-              </w:rPr>
-            </w:r>
-            <w:r>
-              <w:rPr>
-                <w:noProof/>
-                <w:webHidden/>
-                <w:color w:val="000000" w:themeColor="text1"/>
-              </w:rPr>
-              <w:fldChar w:fldCharType="separate"/>
-            </w:r>
-            <w:r>
-              <w:rPr>
-                <w:noProof/>
-                <w:webHidden/>
-                <w:color w:val="000000" w:themeColor="text1"/>
-              </w:rPr>
-              <w:t>11</w:t>
-            </w:r>
-            <w:r>
-              <w:rPr>
-                <w:noProof/>
-                <w:webHidden/>
-                <w:color w:val="000000" w:themeColor="text1"/>
-              </w:rPr>
-              <w:fldChar w:fldCharType="end"/>
-            </w:r>
-          </w:hyperlink>
-        </w:p>
-        <w:p>
-          <w:pPr>
-            <w:pStyle w:val="TM2"/>
-            <w:tabs>
-              <w:tab w:val="right" w:leader="dot" w:pos="8656"/>
-            </w:tabs>
-            <w:rPr>
-              <w:noProof/>
-              <w:color w:val="000000" w:themeColor="text1"/>
-            </w:rPr>
-          </w:pPr>
-          <w:hyperlink w:anchor="_Toc235790518" w:history="1">
-            <w:r>
-              <w:rPr>
-                <w:rStyle w:val="Lienhypertexte"/>
-                <w:noProof/>
-                <w:color w:val="000000" w:themeColor="text1"/>
-              </w:rPr>
-              <w:t>4.2 INSEE : methodes de deflation et prevision a court terme</w:t>
-            </w:r>
-            <w:r>
-              <w:rPr>
-                <w:noProof/>
-                <w:webHidden/>
-                <w:color w:val="000000" w:themeColor="text1"/>
-              </w:rPr>
-              <w:tab/>
-            </w:r>
-            <w:r>
-              <w:rPr>
-                <w:noProof/>
-                <w:webHidden/>
-                <w:color w:val="000000" w:themeColor="text1"/>
-              </w:rPr>
-              <w:fldChar w:fldCharType="begin"/>
-            </w:r>
-            <w:r>
-              <w:rPr>
-                <w:noProof/>
-                <w:webHidden/>
-                <w:color w:val="000000" w:themeColor="text1"/>
-              </w:rPr>
-              <w:instrText xml:space="preserve"> PAGEREF _Toc235790518 \h </w:instrText>
-            </w:r>
-            <w:r>
-              <w:rPr>
-                <w:noProof/>
-                <w:webHidden/>
-                <w:color w:val="000000" w:themeColor="text1"/>
-              </w:rPr>
-            </w:r>
-            <w:r>
-              <w:rPr>
-                <w:noProof/>
-                <w:webHidden/>
-                <w:color w:val="000000" w:themeColor="text1"/>
-              </w:rPr>
-              <w:fldChar w:fldCharType="separate"/>
-            </w:r>
-            <w:r>
-              <w:rPr>
-                <w:noProof/>
-                <w:webHidden/>
-                <w:color w:val="000000" w:themeColor="text1"/>
-              </w:rPr>
-              <w:t>11</w:t>
-            </w:r>
-            <w:r>
-              <w:rPr>
-                <w:noProof/>
-                <w:webHidden/>
-                <w:color w:val="000000" w:themeColor="text1"/>
-              </w:rPr>
-              <w:fldChar w:fldCharType="end"/>
-            </w:r>
-          </w:hyperlink>
-        </w:p>
-        <w:p>
-          <w:pPr>
-            <w:pStyle w:val="TM2"/>
-            <w:tabs>
-              <w:tab w:val="right" w:leader="dot" w:pos="8656"/>
-            </w:tabs>
-            <w:rPr>
-              <w:noProof/>
-              <w:color w:val="000000" w:themeColor="text1"/>
-            </w:rPr>
-          </w:pPr>
-          <w:hyperlink w:anchor="_Toc235790519" w:history="1">
-            <w:r>
-              <w:rPr>
-                <w:rStyle w:val="Lienhypertexte"/>
-                <w:noProof/>
-                <w:color w:val="000000" w:themeColor="text1"/>
-              </w:rPr>
-              <w:t>4.3 Travaux academiques recents sur Prophet et les series macro-economiques</w:t>
-            </w:r>
-            <w:r>
-              <w:rPr>
-                <w:noProof/>
-                <w:webHidden/>
-                <w:color w:val="000000" w:themeColor="text1"/>
-              </w:rPr>
-              <w:tab/>
-            </w:r>
-            <w:r>
-              <w:rPr>
-                <w:noProof/>
-                <w:webHidden/>
-                <w:color w:val="000000" w:themeColor="text1"/>
-              </w:rPr>
-              <w:fldChar w:fldCharType="begin"/>
-            </w:r>
-            <w:r>
-              <w:rPr>
-                <w:noProof/>
-                <w:webHidden/>
-                <w:color w:val="000000" w:themeColor="text1"/>
-              </w:rPr>
-              <w:instrText xml:space="preserve"> PAGEREF _Toc235790519 \h </w:instrText>
-            </w:r>
-            <w:r>
-              <w:rPr>
-                <w:noProof/>
-                <w:webHidden/>
-                <w:color w:val="000000" w:themeColor="text1"/>
-              </w:rPr>
-            </w:r>
-            <w:r>
-              <w:rPr>
-                <w:noProof/>
-                <w:webHidden/>
-                <w:color w:val="000000" w:themeColor="text1"/>
-              </w:rPr>
-              <w:fldChar w:fldCharType="separate"/>
-            </w:r>
-            <w:r>
-              <w:rPr>
-                <w:noProof/>
-                <w:webHidden/>
-                <w:color w:val="000000" w:themeColor="text1"/>
-              </w:rPr>
-              <w:t>12</w:t>
-            </w:r>
-            <w:r>
-              <w:rPr>
-                <w:noProof/>
-                <w:webHidden/>
-                <w:color w:val="000000" w:themeColor="text1"/>
-              </w:rPr>
-              <w:fldChar w:fldCharType="end"/>
-            </w:r>
-          </w:hyperlink>
-        </w:p>
-        <w:p>
-          <w:pPr>
-            <w:pStyle w:val="TM2"/>
-            <w:tabs>
-              <w:tab w:val="right" w:leader="dot" w:pos="8656"/>
-            </w:tabs>
-            <w:rPr>
-              <w:noProof/>
-              <w:color w:val="000000" w:themeColor="text1"/>
-            </w:rPr>
-          </w:pPr>
-          <w:hyperlink w:anchor="_Toc235790520" w:history="1">
-            <w:r>
-              <w:rPr>
-                <w:rStyle w:val="Lienhypertexte"/>
-                <w:noProof/>
-                <w:color w:val="000000" w:themeColor="text1"/>
-              </w:rPr>
-              <w:t>4.4 Limites des modeles face aux chocs exogenes</w:t>
-            </w:r>
-            <w:r>
-              <w:rPr>
-                <w:noProof/>
-                <w:webHidden/>
-                <w:color w:val="000000" w:themeColor="text1"/>
-              </w:rPr>
-              <w:tab/>
-            </w:r>
-            <w:r>
-              <w:rPr>
-                <w:noProof/>
-                <w:webHidden/>
-                <w:color w:val="000000" w:themeColor="text1"/>
-              </w:rPr>
-              <w:fldChar w:fldCharType="begin"/>
-            </w:r>
-            <w:r>
-              <w:rPr>
-                <w:noProof/>
-                <w:webHidden/>
-                <w:color w:val="000000" w:themeColor="text1"/>
-              </w:rPr>
-              <w:instrText xml:space="preserve"> PAGEREF _Toc235790520 \h </w:instrText>
-            </w:r>
-            <w:r>
-              <w:rPr>
-                <w:noProof/>
-                <w:webHidden/>
-                <w:color w:val="000000" w:themeColor="text1"/>
-              </w:rPr>
-            </w:r>
-            <w:r>
-              <w:rPr>
-                <w:noProof/>
-                <w:webHidden/>
-                <w:color w:val="000000" w:themeColor="text1"/>
-              </w:rPr>
-              <w:fldChar w:fldCharType="separate"/>
-            </w:r>
-            <w:r>
-              <w:rPr>
-                <w:noProof/>
-                <w:webHidden/>
-                <w:color w:val="000000" w:themeColor="text1"/>
-              </w:rPr>
-              <w:t>12</w:t>
-            </w:r>
-            <w:r>
-              <w:rPr>
-                <w:noProof/>
-                <w:webHidden/>
-                <w:color w:val="000000" w:themeColor="text1"/>
-              </w:rPr>
-              <w:fldChar w:fldCharType="end"/>
-            </w:r>
-          </w:hyperlink>
-        </w:p>
-        <w:p>
-          <w:pPr>
-            <w:pStyle w:val="TM1"/>
-            <w:tabs>
-              <w:tab w:val="right" w:leader="dot" w:pos="8656"/>
-            </w:tabs>
-            <w:rPr>
-              <w:noProof/>
-              <w:color w:val="000000" w:themeColor="text1"/>
-            </w:rPr>
-          </w:pPr>
-          <w:hyperlink w:anchor="_Toc235790521" w:history="1">
-            <w:r>
-              <w:rPr>
-                <w:rStyle w:val="Lienhypertexte"/>
-                <w:noProof/>
-                <w:color w:val="000000" w:themeColor="text1"/>
-              </w:rPr>
-              <w:t>5. Justification du choix technologique</w:t>
-            </w:r>
-            <w:r>
-              <w:rPr>
-                <w:noProof/>
-                <w:webHidden/>
-                <w:color w:val="000000" w:themeColor="text1"/>
-              </w:rPr>
-              <w:tab/>
-            </w:r>
-            <w:r>
-              <w:rPr>
-                <w:noProof/>
-                <w:webHidden/>
-                <w:color w:val="000000" w:themeColor="text1"/>
-              </w:rPr>
-              <w:fldChar w:fldCharType="begin"/>
-            </w:r>
-            <w:r>
-              <w:rPr>
-                <w:noProof/>
-                <w:webHidden/>
-                <w:color w:val="000000" w:themeColor="text1"/>
-              </w:rPr>
-              <w:instrText xml:space="preserve"> PAGEREF _Toc235790521 \h </w:instrText>
-            </w:r>
-            <w:r>
-              <w:rPr>
-                <w:noProof/>
-                <w:webHidden/>
-                <w:color w:val="000000" w:themeColor="text1"/>
-              </w:rPr>
-            </w:r>
-            <w:r>
-              <w:rPr>
-                <w:noProof/>
-                <w:webHidden/>
-                <w:color w:val="000000" w:themeColor="text1"/>
-              </w:rPr>
-              <w:fldChar w:fldCharType="separate"/>
-            </w:r>
-            <w:r>
-              <w:rPr>
-                <w:noProof/>
-                <w:webHidden/>
-                <w:color w:val="000000" w:themeColor="text1"/>
-              </w:rPr>
-              <w:t>14</w:t>
-            </w:r>
-            <w:r>
-              <w:rPr>
-                <w:noProof/>
-                <w:webHidden/>
-                <w:color w:val="000000" w:themeColor="text1"/>
-              </w:rPr>
-              <w:fldChar w:fldCharType="end"/>
-            </w:r>
-          </w:hyperlink>
-        </w:p>
-        <w:p>
-          <w:pPr>
-            <w:pStyle w:val="TM2"/>
-            <w:tabs>
-              <w:tab w:val="right" w:leader="dot" w:pos="8656"/>
-            </w:tabs>
-            <w:rPr>
-              <w:noProof/>
-              <w:color w:val="000000" w:themeColor="text1"/>
-            </w:rPr>
-          </w:pPr>
-          <w:hyperlink w:anchor="_Toc235790522" w:history="1">
-            <w:r>
-              <w:rPr>
-                <w:rStyle w:val="Lienhypertexte"/>
-                <w:noProof/>
-                <w:color w:val="000000" w:themeColor="text1"/>
-              </w:rPr>
-              <w:t>5.1 Prophet retenu : analyse des criteres</w:t>
-            </w:r>
-            <w:r>
-              <w:rPr>
-                <w:noProof/>
-                <w:webHidden/>
-                <w:color w:val="000000" w:themeColor="text1"/>
-              </w:rPr>
-              <w:tab/>
-            </w:r>
-            <w:r>
-              <w:rPr>
-                <w:noProof/>
-                <w:webHidden/>
-                <w:color w:val="000000" w:themeColor="text1"/>
-              </w:rPr>
-              <w:fldChar w:fldCharType="begin"/>
-            </w:r>
-            <w:r>
-              <w:rPr>
-                <w:noProof/>
-                <w:webHidden/>
-                <w:color w:val="000000" w:themeColor="text1"/>
-              </w:rPr>
-              <w:instrText xml:space="preserve"> PAGEREF _Toc235790522 \h </w:instrText>
-            </w:r>
-            <w:r>
-              <w:rPr>
-                <w:noProof/>
-                <w:webHidden/>
-                <w:color w:val="000000" w:themeColor="text1"/>
-              </w:rPr>
-            </w:r>
-            <w:r>
-              <w:rPr>
-                <w:noProof/>
-                <w:webHidden/>
-                <w:color w:val="000000" w:themeColor="text1"/>
-              </w:rPr>
-              <w:fldChar w:fldCharType="separate"/>
-            </w:r>
-            <w:r>
-              <w:rPr>
-                <w:noProof/>
-                <w:webHidden/>
-                <w:color w:val="000000" w:themeColor="text1"/>
-              </w:rPr>
-              <w:t>14</w:t>
-            </w:r>
-            <w:r>
-              <w:rPr>
-                <w:noProof/>
-                <w:webHidden/>
-                <w:color w:val="000000" w:themeColor="text1"/>
-              </w:rPr>
-              <w:fldChar w:fldCharType="end"/>
-            </w:r>
-          </w:hyperlink>
-        </w:p>
-        <w:p>
-          <w:pPr>
-            <w:pStyle w:val="TM2"/>
-            <w:tabs>
-              <w:tab w:val="right" w:leader="dot" w:pos="8656"/>
-            </w:tabs>
-            <w:rPr>
-              <w:noProof/>
-              <w:color w:val="000000" w:themeColor="text1"/>
-            </w:rPr>
-          </w:pPr>
-          <w:hyperlink w:anchor="_Toc235790523" w:history="1">
-            <w:r>
-              <w:rPr>
-                <w:rStyle w:val="Lienhypertexte"/>
-                <w:noProof/>
-                <w:color w:val="000000" w:themeColor="text1"/>
-              </w:rPr>
-              <w:t>5.2 LSTM ecarte : justification</w:t>
-            </w:r>
-            <w:r>
-              <w:rPr>
-                <w:noProof/>
-                <w:webHidden/>
-                <w:color w:val="000000" w:themeColor="text1"/>
-              </w:rPr>
-              <w:tab/>
-            </w:r>
-            <w:r>
-              <w:rPr>
-                <w:noProof/>
-                <w:webHidden/>
-                <w:color w:val="000000" w:themeColor="text1"/>
-              </w:rPr>
-              <w:fldChar w:fldCharType="begin"/>
-            </w:r>
-            <w:r>
-              <w:rPr>
-                <w:noProof/>
-                <w:webHidden/>
-                <w:color w:val="000000" w:themeColor="text1"/>
-              </w:rPr>
-              <w:instrText xml:space="preserve"> PAGEREF _Toc235790523 \h </w:instrText>
-            </w:r>
-            <w:r>
-              <w:rPr>
-                <w:noProof/>
-                <w:webHidden/>
-                <w:color w:val="000000" w:themeColor="text1"/>
-              </w:rPr>
-            </w:r>
-            <w:r>
-              <w:rPr>
-                <w:noProof/>
-                <w:webHidden/>
-                <w:color w:val="000000" w:themeColor="text1"/>
-              </w:rPr>
-              <w:fldChar w:fldCharType="separate"/>
-            </w:r>
-            <w:r>
-              <w:rPr>
-                <w:noProof/>
-                <w:webHidden/>
-                <w:color w:val="000000" w:themeColor="text1"/>
-              </w:rPr>
-              <w:t>16</w:t>
-            </w:r>
-            <w:r>
-              <w:rPr>
-                <w:noProof/>
-                <w:webHidden/>
-                <w:color w:val="000000" w:themeColor="text1"/>
-              </w:rPr>
-              <w:fldChar w:fldCharType="end"/>
-            </w:r>
-          </w:hyperlink>
-        </w:p>
-        <w:p>
-          <w:pPr>
-            <w:pStyle w:val="TM2"/>
-            <w:tabs>
-              <w:tab w:val="right" w:leader="dot" w:pos="8656"/>
-            </w:tabs>
-            <w:rPr>
-              <w:noProof/>
-              <w:color w:val="000000" w:themeColor="text1"/>
-            </w:rPr>
-          </w:pPr>
-          <w:hyperlink w:anchor="_Toc235790524" w:history="1">
-            <w:r>
-              <w:rPr>
-                <w:rStyle w:val="Lienhypertexte"/>
-                <w:noProof/>
-                <w:color w:val="000000" w:themeColor="text1"/>
-              </w:rPr>
-              <w:t>5.3 ARIMA ecarte : justification</w:t>
-            </w:r>
-            <w:r>
-              <w:rPr>
-                <w:noProof/>
-                <w:webHidden/>
-                <w:color w:val="000000" w:themeColor="text1"/>
-              </w:rPr>
-              <w:tab/>
-            </w:r>
-            <w:r>
-              <w:rPr>
-                <w:noProof/>
-                <w:webHidden/>
-                <w:color w:val="000000" w:themeColor="text1"/>
-              </w:rPr>
-              <w:fldChar w:fldCharType="begin"/>
-            </w:r>
-            <w:r>
-              <w:rPr>
-                <w:noProof/>
-                <w:webHidden/>
-                <w:color w:val="000000" w:themeColor="text1"/>
-              </w:rPr>
-              <w:instrText xml:space="preserve"> PAGEREF _Toc235790524 \h </w:instrText>
-            </w:r>
-            <w:r>
-              <w:rPr>
-                <w:noProof/>
-                <w:webHidden/>
-                <w:color w:val="000000" w:themeColor="text1"/>
-              </w:rPr>
-            </w:r>
-            <w:r>
-              <w:rPr>
-                <w:noProof/>
-                <w:webHidden/>
-                <w:color w:val="000000" w:themeColor="text1"/>
-              </w:rPr>
-              <w:fldChar w:fldCharType="separate"/>
-            </w:r>
-            <w:r>
-              <w:rPr>
-                <w:noProof/>
-                <w:webHidden/>
-                <w:color w:val="000000" w:themeColor="text1"/>
-              </w:rPr>
-              <w:t>16</w:t>
-            </w:r>
-            <w:r>
-              <w:rPr>
-                <w:noProof/>
-                <w:webHidden/>
-                <w:color w:val="000000" w:themeColor="text1"/>
-              </w:rPr>
-              <w:fldChar w:fldCharType="end"/>
-            </w:r>
-          </w:hyperlink>
-        </w:p>
-        <w:p>
-          <w:pPr>
-            <w:pStyle w:val="TM1"/>
-            <w:tabs>
-              <w:tab w:val="right" w:leader="dot" w:pos="8656"/>
-            </w:tabs>
-            <w:rPr>
-              <w:noProof/>
-              <w:color w:val="000000" w:themeColor="text1"/>
-            </w:rPr>
-          </w:pPr>
-          <w:hyperlink w:anchor="_Toc235790525" w:history="1">
-            <w:r>
-              <w:rPr>
-                <w:rStyle w:val="Lienhypertexte"/>
-                <w:noProof/>
-                <w:color w:val="000000" w:themeColor="text1"/>
-              </w:rPr>
-              <w:t>6. Sources et references</w:t>
-            </w:r>
-            <w:r>
-              <w:rPr>
-                <w:noProof/>
-                <w:webHidden/>
-                <w:color w:val="000000" w:themeColor="text1"/>
-              </w:rPr>
-              <w:tab/>
-            </w:r>
-            <w:r>
-              <w:rPr>
-                <w:noProof/>
-                <w:webHidden/>
-                <w:color w:val="000000" w:themeColor="text1"/>
-              </w:rPr>
-              <w:fldChar w:fldCharType="begin"/>
-            </w:r>
-            <w:r>
-              <w:rPr>
-                <w:noProof/>
-                <w:webHidden/>
-                <w:color w:val="000000" w:themeColor="text1"/>
-              </w:rPr>
-              <w:instrText xml:space="preserve"> PAGEREF _Toc235790525 \h </w:instrText>
-            </w:r>
-            <w:r>
-              <w:rPr>
-                <w:noProof/>
-                <w:webHidden/>
-                <w:color w:val="000000" w:themeColor="text1"/>
-              </w:rPr>
-            </w:r>
-            <w:r>
-              <w:rPr>
-                <w:noProof/>
-                <w:webHidden/>
-                <w:color w:val="000000" w:themeColor="text1"/>
-              </w:rPr>
-              <w:fldChar w:fldCharType="separate"/>
-            </w:r>
-            <w:r>
-              <w:rPr>
-                <w:noProof/>
-                <w:webHidden/>
-                <w:color w:val="000000" w:themeColor="text1"/>
-              </w:rPr>
-              <w:t>18</w:t>
-            </w:r>
-            <w:r>
-              <w:rPr>
-                <w:noProof/>
-                <w:webHidden/>
-                <w:color w:val="000000" w:themeColor="text1"/>
               </w:rPr>
               <w:fldChar w:fldCharType="end"/>
             </w:r>
@@ -2671,7 +2425,7 @@
           <w:color w:val="000000" w:themeColor="text1"/>
         </w:rPr>
       </w:pPr>
-      <w:bookmarkStart w:id="0" w:name="_Toc235790501"/>
+      <w:bookmarkStart w:id="0" w:name="_Toc237516248"/>
       <w:r>
         <w:rPr>
           <w:b/>
@@ -2699,7 +2453,7 @@
           <w:color w:val="000000" w:themeColor="text1"/>
         </w:rPr>
       </w:pPr>
-      <w:bookmarkStart w:id="1" w:name="_Toc235790502"/>
+      <w:bookmarkStart w:id="1" w:name="_Toc237516249"/>
       <w:r>
         <w:rPr>
           <w:b/>
@@ -3819,7 +3573,7 @@
           <w:color w:val="000000" w:themeColor="text1"/>
         </w:rPr>
       </w:pPr>
-      <w:bookmarkStart w:id="2" w:name="_Toc235790503"/>
+      <w:bookmarkStart w:id="2" w:name="_Toc237516250"/>
       <w:r>
         <w:rPr>
           <w:b/>
@@ -3828,7 +3582,6 @@
         </w:rPr>
         <w:t xml:space="preserve">1.2 </w:t>
       </w:r>
-      <w:bookmarkEnd w:id="2"/>
       <w:r>
         <w:rPr>
           <w:b/>
@@ -3837,6 +3590,7 @@
         </w:rPr>
         <w:t>Problématique</w:t>
       </w:r>
+      <w:bookmarkEnd w:id="2"/>
     </w:p>
     <w:p>
       <w:pPr>
@@ -4148,7 +3902,7 @@
           <w:color w:val="000000" w:themeColor="text1"/>
         </w:rPr>
       </w:pPr>
-      <w:bookmarkStart w:id="3" w:name="_Toc235790504"/>
+      <w:bookmarkStart w:id="3" w:name="_Toc237516251"/>
       <w:r>
         <w:rPr>
           <w:b/>
@@ -4574,7 +4328,7 @@
           <w:color w:val="000000" w:themeColor="text1"/>
         </w:rPr>
       </w:pPr>
-      <w:bookmarkStart w:id="4" w:name="_Toc235790505"/>
+      <w:bookmarkStart w:id="4" w:name="_Toc237516252"/>
       <w:r>
         <w:rPr>
           <w:b/>
@@ -4650,7 +4404,7 @@
           <w:color w:val="000000" w:themeColor="text1"/>
         </w:rPr>
       </w:pPr>
-      <w:bookmarkStart w:id="5" w:name="_Toc235790506"/>
+      <w:bookmarkStart w:id="5" w:name="_Toc237516253"/>
       <w:r>
         <w:rPr>
           <w:b/>
@@ -4694,7 +4448,7 @@
           <w:color w:val="000000" w:themeColor="text1"/>
         </w:rPr>
       </w:pPr>
-      <w:bookmarkStart w:id="6" w:name="_Toc235790507"/>
+      <w:bookmarkStart w:id="6" w:name="_Toc237516254"/>
       <w:r>
         <w:rPr>
           <w:b/>
@@ -5505,7 +5259,7 @@
           <w:color w:val="000000" w:themeColor="text1"/>
         </w:rPr>
       </w:pPr>
-      <w:bookmarkStart w:id="7" w:name="_Toc235790508"/>
+      <w:bookmarkStart w:id="7" w:name="_Toc237516255"/>
       <w:r>
         <w:rPr>
           <w:b/>
@@ -6131,7 +5885,7 @@
           <w:color w:val="000000" w:themeColor="text1"/>
         </w:rPr>
       </w:pPr>
-      <w:bookmarkStart w:id="8" w:name="_Toc235790511"/>
+      <w:bookmarkStart w:id="8" w:name="_Toc237516256"/>
       <w:r>
         <w:rPr>
           <w:b/>
@@ -6167,7 +5921,7 @@
           <w:color w:val="000000" w:themeColor="text1"/>
         </w:rPr>
       </w:pPr>
-      <w:bookmarkStart w:id="9" w:name="_Toc235790512"/>
+      <w:bookmarkStart w:id="9" w:name="_Toc237516257"/>
       <w:r>
         <w:rPr>
           <w:b/>
@@ -7081,7 +6835,7 @@
           <w:color w:val="000000" w:themeColor="text1"/>
         </w:rPr>
       </w:pPr>
-      <w:bookmarkStart w:id="10" w:name="_Toc235790513"/>
+      <w:bookmarkStart w:id="10" w:name="_Toc237516258"/>
       <w:r>
         <w:rPr>
           <w:b/>
@@ -7615,7 +7369,7 @@
           <w:color w:val="000000" w:themeColor="text1"/>
         </w:rPr>
       </w:pPr>
-      <w:bookmarkStart w:id="11" w:name="_Toc235790514"/>
+      <w:bookmarkStart w:id="11" w:name="_Toc237516259"/>
       <w:r>
         <w:rPr>
           <w:b/>
@@ -8962,7 +8716,7 @@
           <w:color w:val="000000" w:themeColor="text1"/>
         </w:rPr>
       </w:pPr>
-      <w:bookmarkStart w:id="12" w:name="_Toc235790515"/>
+      <w:bookmarkStart w:id="12" w:name="_Toc237516260"/>
       <w:r>
         <w:rPr>
           <w:b/>
@@ -11332,7 +11086,7 @@
           <w:color w:val="000000" w:themeColor="text1"/>
         </w:rPr>
       </w:pPr>
-      <w:bookmarkStart w:id="13" w:name="_Toc235790516"/>
+      <w:bookmarkStart w:id="13" w:name="_Toc237516261"/>
       <w:r>
         <w:rPr>
           <w:b/>
@@ -11376,7 +11130,7 @@
           <w:color w:val="000000" w:themeColor="text1"/>
         </w:rPr>
       </w:pPr>
-      <w:bookmarkStart w:id="14" w:name="_Toc235790517"/>
+      <w:bookmarkStart w:id="14" w:name="_Toc237516262"/>
       <w:r>
         <w:rPr>
           <w:b/>
@@ -11871,7 +11625,7 @@
           <w:color w:val="000000" w:themeColor="text1"/>
         </w:rPr>
       </w:pPr>
-      <w:bookmarkStart w:id="15" w:name="_Toc235790518"/>
+      <w:bookmarkStart w:id="15" w:name="_Toc237516263"/>
       <w:r>
         <w:rPr>
           <w:b/>
@@ -12343,7 +12097,7 @@
           <w:color w:val="000000" w:themeColor="text1"/>
         </w:rPr>
       </w:pPr>
-      <w:bookmarkStart w:id="16" w:name="_Toc235790519"/>
+      <w:bookmarkStart w:id="16" w:name="_Toc237516264"/>
       <w:r>
         <w:rPr>
           <w:b/>
@@ -12400,7 +12154,6 @@
         </w:rPr>
         <w:t xml:space="preserve"> </w:t>
       </w:r>
-      <w:bookmarkEnd w:id="16"/>
       <w:r>
         <w:rPr>
           <w:b/>
@@ -12409,6 +12162,7 @@
         </w:rPr>
         <w:t>macro-économiques</w:t>
       </w:r>
+      <w:bookmarkEnd w:id="16"/>
     </w:p>
     <w:p>
       <w:pPr>
@@ -13203,7 +12957,7 @@
           <w:color w:val="000000" w:themeColor="text1"/>
         </w:rPr>
       </w:pPr>
-      <w:bookmarkStart w:id="17" w:name="_Toc235790520"/>
+      <w:bookmarkStart w:id="17" w:name="_Toc237516265"/>
       <w:r>
         <w:rPr>
           <w:b/>
@@ -13228,7 +12982,6 @@
         </w:rPr>
         <w:t xml:space="preserve"> face aux chocs </w:t>
       </w:r>
-      <w:bookmarkEnd w:id="17"/>
       <w:r>
         <w:rPr>
           <w:b/>
@@ -13237,6 +12990,7 @@
         </w:rPr>
         <w:t>exogènes</w:t>
       </w:r>
+      <w:bookmarkEnd w:id="17"/>
     </w:p>
     <w:p>
       <w:pPr>
@@ -13825,7 +13579,6 @@
           </wp:inline>
         </w:drawing>
       </w:r>
-      <w:bookmarkStart w:id="18" w:name="_Toc235790521"/>
     </w:p>
     <w:p>
       <w:pPr>
@@ -13854,6 +13607,7 @@
           <w:color w:val="000000" w:themeColor="text1"/>
         </w:rPr>
       </w:pPr>
+      <w:bookmarkStart w:id="18" w:name="_Toc237516266"/>
       <w:r>
         <w:rPr>
           <w:b/>
@@ -13882,7 +13636,7 @@
           <w:color w:val="000000" w:themeColor="text1"/>
         </w:rPr>
       </w:pPr>
-      <w:bookmarkStart w:id="19" w:name="_Toc235790522"/>
+      <w:bookmarkStart w:id="19" w:name="_Toc237516267"/>
       <w:r>
         <w:rPr>
           <w:b/>
@@ -13891,7 +13645,6 @@
         </w:rPr>
         <w:t xml:space="preserve">5.1 Prophet retenu : analyse des </w:t>
       </w:r>
-      <w:bookmarkEnd w:id="19"/>
       <w:r>
         <w:rPr>
           <w:b/>
@@ -13900,6 +13653,7 @@
         </w:rPr>
         <w:t>critères</w:t>
       </w:r>
+      <w:bookmarkEnd w:id="19"/>
     </w:p>
     <w:p>
       <w:pPr>
@@ -16708,7 +16462,7 @@
           <w:color w:val="000000" w:themeColor="text1"/>
         </w:rPr>
       </w:pPr>
-      <w:bookmarkStart w:id="20" w:name="_Toc235790523"/>
+      <w:bookmarkStart w:id="20" w:name="_Toc237516268"/>
       <w:r>
         <w:rPr>
           <w:b/>
@@ -17164,7 +16918,7 @@
           <w:color w:val="000000" w:themeColor="text1"/>
         </w:rPr>
       </w:pPr>
-      <w:bookmarkStart w:id="21" w:name="_Toc235790524"/>
+      <w:bookmarkStart w:id="21" w:name="_Toc237516269"/>
       <w:r>
         <w:rPr>
           <w:b/>
@@ -17578,7 +17332,6 @@
           <w:color w:val="000000" w:themeColor="text1"/>
         </w:rPr>
       </w:pPr>
-      <w:bookmarkStart w:id="22" w:name="_Toc235790525"/>
     </w:p>
     <w:p>
       <w:pPr>
@@ -17589,6 +17342,7 @@
           <w:color w:val="000000" w:themeColor="text1"/>
         </w:rPr>
       </w:pPr>
+      <w:bookmarkStart w:id="22" w:name="_Toc237516270"/>
       <w:r>
         <w:rPr>
           <w:b/>
@@ -17597,7 +17351,6 @@
         </w:rPr>
         <w:t xml:space="preserve">6. Sources et </w:t>
       </w:r>
-      <w:bookmarkEnd w:id="22"/>
       <w:r>
         <w:rPr>
           <w:b/>
@@ -17606,6 +17359,7 @@
         </w:rPr>
         <w:t>références</w:t>
       </w:r>
+      <w:bookmarkEnd w:id="22"/>
     </w:p>
     <w:p>
       <w:pPr>
@@ -19235,7 +18989,7 @@
 </file>
 
 <file path=word/endnotes.xml><?xml version="1.0" encoding="utf-8"?>
-<w:endnotes xmlns:wpc="http://schemas.microsoft.com/office/word/2010/wordprocessingCanvas" xmlns:cx="http://schemas.microsoft.com/office/drawing/2014/chartex" xmlns:cx1="http://schemas.microsoft.com/office/drawing/2015/9/8/chartex" xmlns:cx2="http://schemas.microsoft.com/office/drawing/2015/10/21/chartex" xmlns:cx3="http://schemas.microsoft.com/office/drawing/2016/5/9/chartex" xmlns:cx4="http://schemas.microsoft.com/office/drawing/2016/5/10/chartex" xmlns:cx5="http://schemas.microsoft.com/office/drawing/2016/5/11/chartex" xmlns:cx6="http://schemas.microsoft.com/office/drawing/2016/5/12/chartex" xmlns:cx7="http://schemas.microsoft.com/office/drawing/2016/5/13/chartex" xmlns:cx8="http://schemas.microsoft.com/office/drawing/2016/5/14/chartex" xmlns:mc="http://schemas.openxmlformats.org/markup-compatibility/2006" xmlns:aink="http://schemas.microsoft.com/office/drawing/2016/ink" xmlns:am3d="http://schemas.microsoft.com/office/drawing/2017/model3d" xmlns:o="urn:schemas-microsoft-com:office:office" xmlns:oel="http://schemas.microsoft.com/office/2019/extlst" xmlns:r="http://schemas.openxmlformats.org/officeDocument/2006/relationships" xmlns:m="http://schemas.openxmlformats.org/officeDocument/2006/math" xmlns:v="urn:schemas-microsoft-com:vml" xmlns:wp14="http://schemas.microsoft.com/office/word/2010/wordprocessingDrawing" xmlns:wp="http://schemas.openxmlformats.org/drawingml/2006/wordprocessingDrawing" xmlns:w10="urn:schemas-microsoft-com:office:word" xmlns:w="http://schemas.openxmlformats.org/wordprocessingml/2006/main" xmlns:w14="http://schemas.microsoft.com/office/word/2010/wordml" xmlns:w15="http://schemas.microsoft.com/office/word/2012/wordml" xmlns:w16cex="http://schemas.microsoft.com/office/word/2018/wordml/cex" xmlns:w16cid="http://schemas.microsoft.com/office/word/2016/wordml/cid" xmlns:w16="http://schemas.microsoft.com/office/word/2018/wordml" xmlns:w16du="http://schemas.microsoft.com/office/word/2023/wordml/word16du" xmlns:w16sdtdh="http://schemas.microsoft.com/office/word/2020/wordml/sdtdatahash" xmlns:w16sdtfl="http://schemas.microsoft.com/office/word/2024/wordml/sdtformatlock" xmlns:w16se="http://schemas.microsoft.com/office/word/2015/wordml/symex" xmlns:wpg="http://schemas.microsoft.com/office/word/2010/wordprocessingGroup" xmlns:wpi="http://schemas.microsoft.com/office/word/2010/wordprocessingInk" xmlns:wne="http://schemas.microsoft.com/office/word/2006/wordml" xmlns:wps="http://schemas.microsoft.com/office/word/2010/wordprocessingShape" mc:Ignorable="w14 w15 w16se w16cid w16 w16cex w16sdtdh w16sdtfl w16du wp14">
+<w:endnotes xmlns:wpc="http://schemas.microsoft.com/office/word/2010/wordprocessingCanvas" xmlns:cx="http://schemas.microsoft.com/office/drawing/2014/chartex" xmlns:cx1="http://schemas.microsoft.com/office/drawing/2015/9/8/chartex" xmlns:cx2="http://schemas.microsoft.com/office/drawing/2015/10/21/chartex" xmlns:cx3="http://schemas.microsoft.com/office/drawing/2016/5/9/chartex" xmlns:cx4="http://schemas.microsoft.com/office/drawing/2016/5/10/chartex" xmlns:cx5="http://schemas.microsoft.com/office/drawing/2016/5/11/chartex" xmlns:cx6="http://schemas.microsoft.com/office/drawing/2016/5/12/chartex" xmlns:cx7="http://schemas.microsoft.com/office/drawing/2016/5/13/chartex" xmlns:cx8="http://schemas.microsoft.com/office/drawing/2016/5/14/chartex" xmlns:mc="http://schemas.openxmlformats.org/markup-compatibility/2006" xmlns:aink="http://schemas.microsoft.com/office/drawing/2016/ink" xmlns:am3d="http://schemas.microsoft.com/office/drawing/2017/model3d" xmlns:o="urn:schemas-microsoft-com:office:office" xmlns:oel="http://schemas.microsoft.com/office/2019/extlst" xmlns:r="http://schemas.openxmlformats.org/officeDocument/2006/relationships" xmlns:m="http://schemas.openxmlformats.org/officeDocument/2006/math" xmlns:v="urn:schemas-microsoft-com:vml" xmlns:wp14="http://schemas.microsoft.com/office/word/2010/wordprocessingDrawing" xmlns:wp="http://schemas.openxmlformats.org/drawingml/2006/wordprocessingDrawing" xmlns:w10="urn:schemas-microsoft-com:office:word" xmlns:w="http://schemas.openxmlformats.org/wordprocessingml/2006/main" xmlns:w14="http://schemas.microsoft.com/office/word/2010/wordml" xmlns:w15="http://schemas.microsoft.com/office/word/2012/wordml" xmlns:w16cei="http://schemas.microsoft.com/office/word/2026/wordml/cei" xmlns:w16cex="http://schemas.microsoft.com/office/word/2018/wordml/cex" xmlns:w16cid="http://schemas.microsoft.com/office/word/2016/wordml/cid" xmlns:w16="http://schemas.microsoft.com/office/word/2018/wordml" xmlns:w16du="http://schemas.microsoft.com/office/word/2023/wordml/word16du" xmlns:w16sdtdh="http://schemas.microsoft.com/office/word/2020/wordml/sdtdatahash" xmlns:w16sdtfl="http://schemas.microsoft.com/office/word/2024/wordml/sdtformatlock" xmlns:w16se="http://schemas.microsoft.com/office/word/2015/wordml/symex" xmlns:wpg="http://schemas.microsoft.com/office/word/2010/wordprocessingGroup" xmlns:wpi="http://schemas.microsoft.com/office/word/2010/wordprocessingInk" xmlns:wne="http://schemas.microsoft.com/office/word/2006/wordml" xmlns:wps="http://schemas.microsoft.com/office/word/2010/wordprocessingShape" mc:Ignorable="w14 w15 w16se w16cid w16 w16cex w16sdtdh w16sdtfl w16du wp14">
   <w:endnote w:type="separator" w:id="-1">
     <w:p>
       <w:r>
@@ -19254,7 +19008,7 @@
 </file>
 
 <file path=word/footer1.xml><?xml version="1.0" encoding="utf-8"?>
-<w:ftr xmlns:wpc="http://schemas.microsoft.com/office/word/2010/wordprocessingCanvas" xmlns:cx="http://schemas.microsoft.com/office/drawing/2014/chartex" xmlns:cx1="http://schemas.microsoft.com/office/drawing/2015/9/8/chartex" xmlns:cx2="http://schemas.microsoft.com/office/drawing/2015/10/21/chartex" xmlns:cx3="http://schemas.microsoft.com/office/drawing/2016/5/9/chartex" xmlns:cx4="http://schemas.microsoft.com/office/drawing/2016/5/10/chartex" xmlns:cx5="http://schemas.microsoft.com/office/drawing/2016/5/11/chartex" xmlns:cx6="http://schemas.microsoft.com/office/drawing/2016/5/12/chartex" xmlns:cx7="http://schemas.microsoft.com/office/drawing/2016/5/13/chartex" xmlns:cx8="http://schemas.microsoft.com/office/drawing/2016/5/14/chartex" xmlns:mc="http://schemas.openxmlformats.org/markup-compatibility/2006" xmlns:aink="http://schemas.microsoft.com/office/drawing/2016/ink" xmlns:am3d="http://schemas.microsoft.com/office/drawing/2017/model3d" xmlns:o="urn:schemas-microsoft-com:office:office" xmlns:oel="http://schemas.microsoft.com/office/2019/extlst" xmlns:r="http://schemas.openxmlformats.org/officeDocument/2006/relationships" xmlns:m="http://schemas.openxmlformats.org/officeDocument/2006/math" xmlns:v="urn:schemas-microsoft-com:vml" xmlns:wp14="http://schemas.microsoft.com/office/word/2010/wordprocessingDrawing" xmlns:wp="http://schemas.openxmlformats.org/drawingml/2006/wordprocessingDrawing" xmlns:w10="urn:schemas-microsoft-com:office:word" xmlns:w="http://schemas.openxmlformats.org/wordprocessingml/2006/main" xmlns:w14="http://schemas.microsoft.com/office/word/2010/wordml" xmlns:w15="http://schemas.microsoft.com/office/word/2012/wordml" xmlns:w16cex="http://schemas.microsoft.com/office/word/2018/wordml/cex" xmlns:w16cid="http://schemas.microsoft.com/office/word/2016/wordml/cid" xmlns:w16="http://schemas.microsoft.com/office/word/2018/wordml" xmlns:w16du="http://schemas.microsoft.com/office/word/2023/wordml/word16du" xmlns:w16sdtdh="http://schemas.microsoft.com/office/word/2020/wordml/sdtdatahash" xmlns:w16sdtfl="http://schemas.microsoft.com/office/word/2024/wordml/sdtformatlock" xmlns:w16se="http://schemas.microsoft.com/office/word/2015/wordml/symex" xmlns:wpg="http://schemas.microsoft.com/office/word/2010/wordprocessingGroup" xmlns:wpi="http://schemas.microsoft.com/office/word/2010/wordprocessingInk" xmlns:wne="http://schemas.microsoft.com/office/word/2006/wordml" xmlns:wps="http://schemas.microsoft.com/office/word/2010/wordprocessingShape" mc:Ignorable="w14 w15 w16se w16cid w16 w16cex w16sdtdh w16sdtfl w16du wp14">
+<w:ftr xmlns:wpc="http://schemas.microsoft.com/office/word/2010/wordprocessingCanvas" xmlns:cx="http://schemas.microsoft.com/office/drawing/2014/chartex" xmlns:cx1="http://schemas.microsoft.com/office/drawing/2015/9/8/chartex" xmlns:cx2="http://schemas.microsoft.com/office/drawing/2015/10/21/chartex" xmlns:cx3="http://schemas.microsoft.com/office/drawing/2016/5/9/chartex" xmlns:cx4="http://schemas.microsoft.com/office/drawing/2016/5/10/chartex" xmlns:cx5="http://schemas.microsoft.com/office/drawing/2016/5/11/chartex" xmlns:cx6="http://schemas.microsoft.com/office/drawing/2016/5/12/chartex" xmlns:cx7="http://schemas.microsoft.com/office/drawing/2016/5/13/chartex" xmlns:cx8="http://schemas.microsoft.com/office/drawing/2016/5/14/chartex" xmlns:mc="http://schemas.openxmlformats.org/markup-compatibility/2006" xmlns:aink="http://schemas.microsoft.com/office/drawing/2016/ink" xmlns:am3d="http://schemas.microsoft.com/office/drawing/2017/model3d" xmlns:o="urn:schemas-microsoft-com:office:office" xmlns:oel="http://schemas.microsoft.com/office/2019/extlst" xmlns:r="http://schemas.openxmlformats.org/officeDocument/2006/relationships" xmlns:m="http://schemas.openxmlformats.org/officeDocument/2006/math" xmlns:v="urn:schemas-microsoft-com:vml" xmlns:wp14="http://schemas.microsoft.com/office/word/2010/wordprocessingDrawing" xmlns:wp="http://schemas.openxmlformats.org/drawingml/2006/wordprocessingDrawing" xmlns:w10="urn:schemas-microsoft-com:office:word" xmlns:w="http://schemas.openxmlformats.org/wordprocessingml/2006/main" xmlns:w14="http://schemas.microsoft.com/office/word/2010/wordml" xmlns:w15="http://schemas.microsoft.com/office/word/2012/wordml" xmlns:w16cei="http://schemas.microsoft.com/office/word/2026/wordml/cei" xmlns:w16cex="http://schemas.microsoft.com/office/word/2018/wordml/cex" xmlns:w16cid="http://schemas.microsoft.com/office/word/2016/wordml/cid" xmlns:w16="http://schemas.microsoft.com/office/word/2018/wordml" xmlns:w16du="http://schemas.microsoft.com/office/word/2023/wordml/word16du" xmlns:w16sdtdh="http://schemas.microsoft.com/office/word/2020/wordml/sdtdatahash" xmlns:w16sdtfl="http://schemas.microsoft.com/office/word/2024/wordml/sdtformatlock" xmlns:w16se="http://schemas.microsoft.com/office/word/2015/wordml/symex" xmlns:wpg="http://schemas.microsoft.com/office/word/2010/wordprocessingGroup" xmlns:wpi="http://schemas.microsoft.com/office/word/2010/wordprocessingInk" xmlns:wne="http://schemas.microsoft.com/office/word/2006/wordml" xmlns:wps="http://schemas.microsoft.com/office/word/2010/wordprocessingShape" mc:Ignorable="w14 w15 w16se w16cid w16 w16cex w16sdtdh w16sdtfl w16du wp14">
   <w:sdt>
     <w:sdtPr>
       <w:id w:val="1737276984"/>
@@ -19504,7 +19258,7 @@
 </file>
 
 <file path=word/footnotes.xml><?xml version="1.0" encoding="utf-8"?>
-<w:footnotes xmlns:wpc="http://schemas.microsoft.com/office/word/2010/wordprocessingCanvas" xmlns:cx="http://schemas.microsoft.com/office/drawing/2014/chartex" xmlns:cx1="http://schemas.microsoft.com/office/drawing/2015/9/8/chartex" xmlns:cx2="http://schemas.microsoft.com/office/drawing/2015/10/21/chartex" xmlns:cx3="http://schemas.microsoft.com/office/drawing/2016/5/9/chartex" xmlns:cx4="http://schemas.microsoft.com/office/drawing/2016/5/10/chartex" xmlns:cx5="http://schemas.microsoft.com/office/drawing/2016/5/11/chartex" xmlns:cx6="http://schemas.microsoft.com/office/drawing/2016/5/12/chartex" xmlns:cx7="http://schemas.microsoft.com/office/drawing/2016/5/13/chartex" xmlns:cx8="http://schemas.microsoft.com/office/drawing/2016/5/14/chartex" xmlns:mc="http://schemas.openxmlformats.org/markup-compatibility/2006" xmlns:aink="http://schemas.microsoft.com/office/drawing/2016/ink" xmlns:am3d="http://schemas.microsoft.com/office/drawing/2017/model3d" xmlns:o="urn:schemas-microsoft-com:office:office" xmlns:oel="http://schemas.microsoft.com/office/2019/extlst" xmlns:r="http://schemas.openxmlformats.org/officeDocument/2006/relationships" xmlns:m="http://schemas.openxmlformats.org/officeDocument/2006/math" xmlns:v="urn:schemas-microsoft-com:vml" xmlns:wp14="http://schemas.microsoft.com/office/word/2010/wordprocessingDrawing" xmlns:wp="http://schemas.openxmlformats.org/drawingml/2006/wordprocessingDrawing" xmlns:w10="urn:schemas-microsoft-com:office:word" xmlns:w="http://schemas.openxmlformats.org/wordprocessingml/2006/main" xmlns:w14="http://schemas.microsoft.com/office/word/2010/wordml" xmlns:w15="http://schemas.microsoft.com/office/word/2012/wordml" xmlns:w16cex="http://schemas.microsoft.com/office/word/2018/wordml/cex" xmlns:w16cid="http://schemas.microsoft.com/office/word/2016/wordml/cid" xmlns:w16="http://schemas.microsoft.com/office/word/2018/wordml" xmlns:w16du="http://schemas.microsoft.com/office/word/2023/wordml/word16du" xmlns:w16sdtdh="http://schemas.microsoft.com/office/word/2020/wordml/sdtdatahash" xmlns:w16sdtfl="http://schemas.microsoft.com/office/word/2024/wordml/sdtformatlock" xmlns:w16se="http://schemas.microsoft.com/office/word/2015/wordml/symex" xmlns:wpg="http://schemas.microsoft.com/office/word/2010/wordprocessingGroup" xmlns:wpi="http://schemas.microsoft.com/office/word/2010/wordprocessingInk" xmlns:wne="http://schemas.microsoft.com/office/word/2006/wordml" xmlns:wps="http://schemas.microsoft.com/office/word/2010/wordprocessingShape" mc:Ignorable="w14 w15 w16se w16cid w16 w16cex w16sdtdh w16sdtfl w16du wp14">
+<w:footnotes xmlns:wpc="http://schemas.microsoft.com/office/word/2010/wordprocessingCanvas" xmlns:cx="http://schemas.microsoft.com/office/drawing/2014/chartex" xmlns:cx1="http://schemas.microsoft.com/office/drawing/2015/9/8/chartex" xmlns:cx2="http://schemas.microsoft.com/office/drawing/2015/10/21/chartex" xmlns:cx3="http://schemas.microsoft.com/office/drawing/2016/5/9/chartex" xmlns:cx4="http://schemas.microsoft.com/office/drawing/2016/5/10/chartex" xmlns:cx5="http://schemas.microsoft.com/office/drawing/2016/5/11/chartex" xmlns:cx6="http://schemas.microsoft.com/office/drawing/2016/5/12/chartex" xmlns:cx7="http://schemas.microsoft.com/office/drawing/2016/5/13/chartex" xmlns:cx8="http://schemas.microsoft.com/office/drawing/2016/5/14/chartex" xmlns:mc="http://schemas.openxmlformats.org/markup-compatibility/2006" xmlns:aink="http://schemas.microsoft.com/office/drawing/2016/ink" xmlns:am3d="http://schemas.microsoft.com/office/drawing/2017/model3d" xmlns:o="urn:schemas-microsoft-com:office:office" xmlns:oel="http://schemas.microsoft.com/office/2019/extlst" xmlns:r="http://schemas.openxmlformats.org/officeDocument/2006/relationships" xmlns:m="http://schemas.openxmlformats.org/officeDocument/2006/math" xmlns:v="urn:schemas-microsoft-com:vml" xmlns:wp14="http://schemas.microsoft.com/office/word/2010/wordprocessingDrawing" xmlns:wp="http://schemas.openxmlformats.org/drawingml/2006/wordprocessingDrawing" xmlns:w10="urn:schemas-microsoft-com:office:word" xmlns:w="http://schemas.openxmlformats.org/wordprocessingml/2006/main" xmlns:w14="http://schemas.microsoft.com/office/word/2010/wordml" xmlns:w15="http://schemas.microsoft.com/office/word/2012/wordml" xmlns:w16cei="http://schemas.microsoft.com/office/word/2026/wordml/cei" xmlns:w16cex="http://schemas.microsoft.com/office/word/2018/wordml/cex" xmlns:w16cid="http://schemas.microsoft.com/office/word/2016/wordml/cid" xmlns:w16="http://schemas.microsoft.com/office/word/2018/wordml" xmlns:w16du="http://schemas.microsoft.com/office/word/2023/wordml/word16du" xmlns:w16sdtdh="http://schemas.microsoft.com/office/word/2020/wordml/sdtdatahash" xmlns:w16sdtfl="http://schemas.microsoft.com/office/word/2024/wordml/sdtformatlock" xmlns:w16se="http://schemas.microsoft.com/office/word/2015/wordml/symex" xmlns:wpg="http://schemas.microsoft.com/office/word/2010/wordprocessingGroup" xmlns:wpi="http://schemas.microsoft.com/office/word/2010/wordprocessingInk" xmlns:wne="http://schemas.microsoft.com/office/word/2006/wordml" xmlns:wps="http://schemas.microsoft.com/office/word/2010/wordprocessingShape" mc:Ignorable="w14 w15 w16se w16cid w16 w16cex w16sdtdh w16sdtfl w16du wp14">
   <w:footnote w:type="separator" w:id="-1">
     <w:p>
       <w:r>
@@ -19523,7 +19277,7 @@
 </file>
 
 <file path=word/numbering.xml><?xml version="1.0" encoding="utf-8"?>
-<w:numbering xmlns:wpc="http://schemas.microsoft.com/office/word/2010/wordprocessingCanvas" xmlns:cx="http://schemas.microsoft.com/office/drawing/2014/chartex" xmlns:cx1="http://schemas.microsoft.com/office/drawing/2015/9/8/chartex" xmlns:cx2="http://schemas.microsoft.com/office/drawing/2015/10/21/chartex" xmlns:cx3="http://schemas.microsoft.com/office/drawing/2016/5/9/chartex" xmlns:cx4="http://schemas.microsoft.com/office/drawing/2016/5/10/chartex" xmlns:cx5="http://schemas.microsoft.com/office/drawing/2016/5/11/chartex" xmlns:cx6="http://schemas.microsoft.com/office/drawing/2016/5/12/chartex" xmlns:cx7="http://schemas.microsoft.com/office/drawing/2016/5/13/chartex" xmlns:cx8="http://schemas.microsoft.com/office/drawing/2016/5/14/chartex" xmlns:mc="http://schemas.openxmlformats.org/markup-compatibility/2006" xmlns:aink="http://schemas.microsoft.com/office/drawing/2016/ink" xmlns:am3d="http://schemas.microsoft.com/office/drawing/2017/model3d" xmlns:o="urn:schemas-microsoft-com:office:office" xmlns:oel="http://schemas.microsoft.com/office/2019/extlst" xmlns:r="http://schemas.openxmlformats.org/officeDocument/2006/relationships" xmlns:m="http://schemas.openxmlformats.org/officeDocument/2006/math" xmlns:v="urn:schemas-microsoft-com:vml" xmlns:wp14="http://schemas.microsoft.com/office/word/2010/wordprocessingDrawing" xmlns:wp="http://schemas.openxmlformats.org/drawingml/2006/wordprocessingDrawing" xmlns:w10="urn:schemas-microsoft-com:office:word" xmlns:w="http://schemas.openxmlformats.org/wordprocessingml/2006/main" xmlns:w14="http://schemas.microsoft.com/office/word/2010/wordml" xmlns:w15="http://schemas.microsoft.com/office/word/2012/wordml" xmlns:w16cex="http://schemas.microsoft.com/office/word/2018/wordml/cex" xmlns:w16cid="http://schemas.microsoft.com/office/word/2016/wordml/cid" xmlns:w16="http://schemas.microsoft.com/office/word/2018/wordml" xmlns:w16du="http://schemas.microsoft.com/office/word/2023/wordml/word16du" xmlns:w16sdtdh="http://schemas.microsoft.com/office/word/2020/wordml/sdtdatahash" xmlns:w16sdtfl="http://schemas.microsoft.com/office/word/2024/wordml/sdtformatlock" xmlns:w16se="http://schemas.microsoft.com/office/word/2015/wordml/symex" xmlns:wpg="http://schemas.microsoft.com/office/word/2010/wordprocessingGroup" xmlns:wpi="http://schemas.microsoft.com/office/word/2010/wordprocessingInk" xmlns:wne="http://schemas.microsoft.com/office/word/2006/wordml" xmlns:wps="http://schemas.microsoft.com/office/word/2010/wordprocessingShape" mc:Ignorable="w14 w15 w16se w16cid w16 w16cex w16sdtdh w16sdtfl w16du wp14">
+<w:numbering xmlns:wpc="http://schemas.microsoft.com/office/word/2010/wordprocessingCanvas" xmlns:cx="http://schemas.microsoft.com/office/drawing/2014/chartex" xmlns:cx1="http://schemas.microsoft.com/office/drawing/2015/9/8/chartex" xmlns:cx2="http://schemas.microsoft.com/office/drawing/2015/10/21/chartex" xmlns:cx3="http://schemas.microsoft.com/office/drawing/2016/5/9/chartex" xmlns:cx4="http://schemas.microsoft.com/office/drawing/2016/5/10/chartex" xmlns:cx5="http://schemas.microsoft.com/office/drawing/2016/5/11/chartex" xmlns:cx6="http://schemas.microsoft.com/office/drawing/2016/5/12/chartex" xmlns:cx7="http://schemas.microsoft.com/office/drawing/2016/5/13/chartex" xmlns:cx8="http://schemas.microsoft.com/office/drawing/2016/5/14/chartex" xmlns:mc="http://schemas.openxmlformats.org/markup-compatibility/2006" xmlns:aink="http://schemas.microsoft.com/office/drawing/2016/ink" xmlns:am3d="http://schemas.microsoft.com/office/drawing/2017/model3d" xmlns:o="urn:schemas-microsoft-com:office:office" xmlns:oel="http://schemas.microsoft.com/office/2019/extlst" xmlns:r="http://schemas.openxmlformats.org/officeDocument/2006/relationships" xmlns:m="http://schemas.openxmlformats.org/officeDocument/2006/math" xmlns:v="urn:schemas-microsoft-com:vml" xmlns:wp14="http://schemas.microsoft.com/office/word/2010/wordprocessingDrawing" xmlns:wp="http://schemas.openxmlformats.org/drawingml/2006/wordprocessingDrawing" xmlns:w10="urn:schemas-microsoft-com:office:word" xmlns:w="http://schemas.openxmlformats.org/wordprocessingml/2006/main" xmlns:w14="http://schemas.microsoft.com/office/word/2010/wordml" xmlns:w15="http://schemas.microsoft.com/office/word/2012/wordml" xmlns:w16cei="http://schemas.microsoft.com/office/word/2026/wordml/cei" xmlns:w16cex="http://schemas.microsoft.com/office/word/2018/wordml/cex" xmlns:w16cid="http://schemas.microsoft.com/office/word/2016/wordml/cid" xmlns:w16="http://schemas.microsoft.com/office/word/2018/wordml" xmlns:w16du="http://schemas.microsoft.com/office/word/2023/wordml/word16du" xmlns:w16sdtdh="http://schemas.microsoft.com/office/word/2020/wordml/sdtdatahash" xmlns:w16sdtfl="http://schemas.microsoft.com/office/word/2024/wordml/sdtformatlock" xmlns:w16se="http://schemas.microsoft.com/office/word/2015/wordml/symex" xmlns:wpg="http://schemas.microsoft.com/office/word/2010/wordprocessingGroup" xmlns:wpi="http://schemas.microsoft.com/office/word/2010/wordprocessingInk" xmlns:wne="http://schemas.microsoft.com/office/word/2006/wordml" xmlns:wps="http://schemas.microsoft.com/office/word/2010/wordprocessingShape" mc:Ignorable="w14 w15 w16se w16cid w16 w16cex w16sdtdh w16sdtfl w16du wp14">
   <w:abstractNum w:abstractNumId="0" w15:restartNumberingAfterBreak="0">
     <w:nsid w:val="09F64393"/>
     <w:multiLevelType w:val="hybridMultilevel"/>

</xml_diff>